<commit_message>
Correct chapter 1 scheduling semantics and tighten validation
</commit_message>
<xml_diff>
--- a/docs/zhihu/chapter-01-gem5-systemc-foundation.docx
+++ b/docs/zhihu/chapter-01-gem5-systemc-foundation.docx
@@ -52,7 +52,7 @@
           <w:sz w:val="21"/>
           <w:lang w:val="en-US" w:eastAsia="zh-CN"/>
         </w:rPr>
-        <w:t>如果只用 C++ 写一个矩阵乘函数，我们只能验证计算公式。如果只在 SystemC 中搭一个 NPU，又很难观察真实 CPU 指令、软件调度和存储系统对它的影响。本文先搭建整个系列的底座：让 gem5 中的 RISC-V CPU 和 SystemC 中的硬件模型运行在同一个进程、同一条仿真时间轴上。</w:t>
+        <w:t>一个不含时序的 C++ 矩阵乘函数主要用于验证计算结果；仅有独立 NPU 模型时，也缺少执行 Guest 软件的 CPU 和配套存储系统。SystemC 本身可以描述这些模块，但本文选择复用 gem5 的 CPU 与存储模型。我们先搭建整个系列的底座：让 gem5 中的 RISC-V CPU 和 SystemC 中的硬件模型运行在同一个进程、同一条仿真时间轴上。</w:t>
       </w:r>
     </w:p>
     <w:p>
@@ -166,7 +166,7 @@
           <w:sz w:val="21"/>
           <w:lang w:val="en-US" w:eastAsia="zh-CN"/>
         </w:rPr>
-        <w:t>周期模型关心数据在什么时候可用。它需要描述 FIFO 深度、模块吞吐率、流水延迟、端口冲突、反压和完成事件。周期模型的精度低于 RTL，但编译速度和运行速度通常更适合早期架构探索。</w:t>
+        <w:t>周期模型关心数据在什么时候可用。它需要描述 FIFO 深度、模块吞吐率、流水延迟、端口冲突、反压和完成事件。它通常省略电路实现细节，运行速度也更适合早期架构探索；但时序精度取决于具体模型和校准情况，不能仅凭使用 C++、SystemC 或 RTL 来判定。RTL 仿真本身也不等于包含布局布线延迟的门级时序仿真。</w:t>
       </w:r>
     </w:p>
     <w:p>
@@ -188,7 +188,7 @@
           <w:sz w:val="21"/>
           <w:lang w:val="en-US" w:eastAsia="zh-CN"/>
         </w:rPr>
-        <w:t>gem5 与 SystemC 的组合位于周期模型这一层：</w:t>
+        <w:t>本系列用 gem5 与 SystemC 构建周期级系统模型。两者接在一起不会自动获得周期精确性，仍需逐项定义和验证时序契约：</w:t>
       </w:r>
     </w:p>
     <w:p>
@@ -203,7 +203,7 @@
           <w:sz w:val="21"/>
           <w:lang w:val="en-US" w:eastAsia="zh-CN"/>
         </w:rPr>
-        <w:t>gem5 负责执行真实 RISC-V Guest ELF，并提供 CPU、cache、地址转换和内存系统模型。</w:t>
+        <w:t>gem5 负责执行 RISC-V Guest ELF，并提供可选的 CPU、cache 和内存系统模型。本章没有配置 cache；SE 使用模拟进程的地址映射，不是完整操作系统的页表遍历路径。</w:t>
       </w:r>
     </w:p>
     <w:p>
@@ -296,7 +296,7 @@
       <w:r>
         <w:drawing>
           <wp:inline xmlns:a="http://schemas.openxmlformats.org/drawingml/2006/main" xmlns:pic="http://schemas.openxmlformats.org/drawingml/2006/picture">
-            <wp:extent cx="4754880" cy="2772095"/>
+            <wp:extent cx="4754880" cy="2731679"/>
             <wp:docPr id="2" name="Picture 2"/>
             <wp:cNvGraphicFramePr>
               <a:graphicFrameLocks noChangeAspect="1"/>
@@ -317,7 +317,7 @@
                   <pic:spPr>
                     <a:xfrm>
                       <a:off x="0" y="0"/>
-                      <a:ext cx="4754880" cy="2772095"/>
+                      <a:ext cx="4754880" cy="2731679"/>
                     </a:xfrm>
                     <a:prstGeom prst="rect"/>
                   </pic:spPr>
@@ -622,7 +622,25 @@
           <w:sz w:val="21"/>
           <w:lang w:val="en-US" w:eastAsia="zh-CN"/>
         </w:rPr>
-        <w:t>单进程方式的优势是所有模块共享同一个仿真时间和对象生命周期。代价是构建链更复杂，而且 gem5、SystemC、编译器和 C++ ABI 必须兼容。</w:t>
+        <w:t xml:space="preserve">单进程方式便于统一时间协调和退出管理，但不会自动统一两个框架的生命周期。本文使用的上游 adapter 只支持单个 gem5 主事件队列、协作式 SystemC 进程，并要求仿真中至多创建一个 </w:t>
+      </w:r>
+      <w:r>
+        <w:rPr>
+          <w:rFonts w:ascii="Menlo" w:hAnsi="Menlo" w:eastAsia="Arial Unicode MS" w:hint="eastAsia"/>
+          <w:color w:val="204E79"/>
+          <w:sz w:val="20"/>
+          <w:lang w:val="en-US" w:eastAsia="zh-CN"/>
+        </w:rPr>
+        <w:t>Gem5SystemC::Module</w:t>
+      </w:r>
+      <w:r>
+        <w:rPr>
+          <w:rFonts w:ascii="Arial Unicode MS" w:hAnsi="Arial Unicode MS" w:eastAsia="Arial Unicode MS" w:hint="eastAsia"/>
+          <w:color w:val="20242A"/>
+          <w:sz w:val="21"/>
+          <w:lang w:val="en-US" w:eastAsia="zh-CN"/>
+        </w:rPr>
+        <w:t>。它不是并行运行多个 gem5 kernel 的通用接口。构建时，gem5、SystemC、编译器和 C++ ABI 也必须兼容。</w:t>
       </w:r>
     </w:p>
     <w:p>
@@ -772,7 +790,7 @@
       <w:r>
         <w:drawing>
           <wp:inline xmlns:a="http://schemas.openxmlformats.org/drawingml/2006/main" xmlns:pic="http://schemas.openxmlformats.org/drawingml/2006/picture">
-            <wp:extent cx="4937760" cy="3009565"/>
+            <wp:extent cx="4937760" cy="2886121"/>
             <wp:docPr id="3" name="Picture 3"/>
             <wp:cNvGraphicFramePr>
               <a:graphicFrameLocks noChangeAspect="1"/>
@@ -793,7 +811,7 @@
                   <pic:spPr>
                     <a:xfrm>
                       <a:off x="0" y="0"/>
-                      <a:ext cx="4937760" cy="3009565"/>
+                      <a:ext cx="4937760" cy="2886121"/>
                     </a:xfrm>
                     <a:prstGeom prst="rect"/>
                   </pic:spPr>
@@ -827,7 +845,97 @@
           <w:sz w:val="21"/>
           <w:lang w:val="en-US" w:eastAsia="zh-CN"/>
         </w:rPr>
-        <w:t>核心逻辑可以概括为：</w:t>
+        <w:t xml:space="preserve">上游的 </w:t>
+      </w:r>
+      <w:r>
+        <w:rPr>
+          <w:rFonts w:ascii="Menlo" w:hAnsi="Menlo" w:eastAsia="Arial Unicode MS" w:hint="eastAsia"/>
+          <w:color w:val="204E79"/>
+          <w:sz w:val="20"/>
+          <w:lang w:val="en-US" w:eastAsia="zh-CN"/>
+        </w:rPr>
+        <w:t>eventLoop()</w:t>
+      </w:r>
+      <w:r>
+        <w:rPr>
+          <w:rFonts w:ascii="Arial Unicode MS" w:hAnsi="Arial Unicode MS" w:eastAsia="Arial Unicode MS" w:hint="eastAsia"/>
+          <w:color w:val="20242A"/>
+          <w:sz w:val="21"/>
+          <w:lang w:val="en-US" w:eastAsia="zh-CN"/>
+        </w:rPr>
+        <w:t xml:space="preserve"> 是 </w:t>
+      </w:r>
+      <w:r>
+        <w:rPr>
+          <w:rFonts w:ascii="Menlo" w:hAnsi="Menlo" w:eastAsia="Arial Unicode MS" w:hint="eastAsia"/>
+          <w:color w:val="204E79"/>
+          <w:sz w:val="20"/>
+          <w:lang w:val="en-US" w:eastAsia="zh-CN"/>
+        </w:rPr>
+        <w:t>SC_METHOD</w:t>
+      </w:r>
+      <w:r>
+        <w:rPr>
+          <w:rFonts w:ascii="Arial Unicode MS" w:hAnsi="Arial Unicode MS" w:eastAsia="Arial Unicode MS" w:hint="eastAsia"/>
+          <w:color w:val="20242A"/>
+          <w:sz w:val="21"/>
+          <w:lang w:val="en-US" w:eastAsia="zh-CN"/>
+        </w:rPr>
+        <w:t xml:space="preserve">，不能在其中调用 </w:t>
+      </w:r>
+      <w:r>
+        <w:rPr>
+          <w:rFonts w:ascii="Menlo" w:hAnsi="Menlo" w:eastAsia="Arial Unicode MS" w:hint="eastAsia"/>
+          <w:color w:val="204E79"/>
+          <w:sz w:val="20"/>
+          <w:lang w:val="en-US" w:eastAsia="zh-CN"/>
+        </w:rPr>
+        <w:t>wait()</w:t>
+      </w:r>
+      <w:r>
+        <w:rPr>
+          <w:rFonts w:ascii="Arial Unicode MS" w:hAnsi="Arial Unicode MS" w:eastAsia="Arial Unicode MS" w:hint="eastAsia"/>
+          <w:color w:val="20242A"/>
+          <w:sz w:val="21"/>
+          <w:lang w:val="en-US" w:eastAsia="zh-CN"/>
+        </w:rPr>
+        <w:t>。它安排定时事件后返回，把控制权交还给 SystemC kernel；</w:t>
+      </w:r>
+      <w:r>
+        <w:rPr>
+          <w:rFonts w:ascii="Menlo" w:hAnsi="Menlo" w:eastAsia="Arial Unicode MS" w:hint="eastAsia"/>
+          <w:color w:val="204E79"/>
+          <w:sz w:val="20"/>
+          <w:lang w:val="en-US" w:eastAsia="zh-CN"/>
+        </w:rPr>
+        <w:t>simulate()</w:t>
+      </w:r>
+      <w:r>
+        <w:rPr>
+          <w:rFonts w:ascii="Arial Unicode MS" w:hAnsi="Arial Unicode MS" w:eastAsia="Arial Unicode MS" w:hint="eastAsia"/>
+          <w:color w:val="20242A"/>
+          <w:sz w:val="21"/>
+          <w:lang w:val="en-US" w:eastAsia="zh-CN"/>
+        </w:rPr>
+        <w:t xml:space="preserve"> 则由 Host 的 </w:t>
+      </w:r>
+      <w:r>
+        <w:rPr>
+          <w:rFonts w:ascii="Menlo" w:hAnsi="Menlo" w:eastAsia="Arial Unicode MS" w:hint="eastAsia"/>
+          <w:color w:val="204E79"/>
+          <w:sz w:val="20"/>
+          <w:lang w:val="en-US" w:eastAsia="zh-CN"/>
+        </w:rPr>
+        <w:t>SC_THREAD</w:t>
+      </w:r>
+      <w:r>
+        <w:rPr>
+          <w:rFonts w:ascii="Arial Unicode MS" w:hAnsi="Arial Unicode MS" w:eastAsia="Arial Unicode MS" w:hint="eastAsia"/>
+          <w:color w:val="20242A"/>
+          <w:sz w:val="21"/>
+          <w:lang w:val="en-US" w:eastAsia="zh-CN"/>
+        </w:rPr>
+        <w:t xml:space="preserve"> 调用，等待退出通知。下面是事件处理方法的示意伪代码，不是可直接编译的替代实现：</w:t>
       </w:r>
     </w:p>
     <w:p>
@@ -846,19 +954,33 @@
         </w:rPr>
         <w:t>while (!gem5_event_queue.empty()) {</w:t>
         <w:br/>
-        <w:t xml:space="preserve">    auto next_tick = gem5_event_queue.nextTick();</w:t>
+        <w:t xml:space="preserve">    catchup();  // Align gem5's current tick with SystemC time.</w:t>
         <w:br/>
+        <w:t xml:space="preserve">    auto next = gem5_event_queue.nextTick();</w:t>
         <w:br/>
-        <w:t xml:space="preserve">    if (next_tick &gt; systemc_now) {</w:t>
+        <w:t xml:space="preserve">    auto now = sc_time_stamp().value();</w:t>
         <w:br/>
-        <w:t xml:space="preserve">        wakeup.notify(next_tick - systemc_now);</w:t>
+        <w:t xml:space="preserve">    if (next &gt; now) {</w:t>
         <w:br/>
-        <w:t xml:space="preserve">        wait(wakeup);</w:t>
+        <w:t xml:space="preserve">        wakeup.notify(sc_time::from_value(next - now));</w:t>
+        <w:br/>
+        <w:t xml:space="preserve">        return;  // SC_METHOD must not call wait().</w:t>
         <w:br/>
         <w:t xml:space="preserve">    }</w:t>
         <w:br/>
+        <w:t xml:space="preserve">    if (next &lt; now) {</w:t>
         <w:br/>
-        <w:t xml:space="preserve">    gem5_event_queue.serviceOne();</w:t>
+        <w:t xml:space="preserve">        fatal("event scheduled in the past");</w:t>
+        <w:br/>
+        <w:t xml:space="preserve">    }</w:t>
+        <w:br/>
+        <w:t xml:space="preserve">    if (gem5_event_queue.serviceOne()) {</w:t>
+        <w:br/>
+        <w:t xml:space="preserve">        exit_notification.notify(SC_ZERO_TIME);</w:t>
+        <w:br/>
+        <w:t xml:space="preserve">        return;</w:t>
+        <w:br/>
+        <w:t xml:space="preserve">    }</w:t>
         <w:br/>
         <w:t>}</w:t>
       </w:r>
@@ -871,7 +993,90 @@
           <w:sz w:val="21"/>
           <w:lang w:val="en-US" w:eastAsia="zh-CN"/>
         </w:rPr>
-        <w:t>真实实现还要处理停止事件、跨边界回调和当前 tick 对齐，但原则就是“谁的下一事件更早，先推进到谁”。</w:t>
+        <w:t xml:space="preserve">上游还使用 </w:t>
+      </w:r>
+      <w:r>
+        <w:rPr>
+          <w:rFonts w:ascii="Menlo" w:hAnsi="Menlo" w:eastAsia="Arial Unicode MS" w:hint="eastAsia"/>
+          <w:color w:val="204E79"/>
+          <w:sz w:val="20"/>
+          <w:lang w:val="en-US" w:eastAsia="zh-CN"/>
+        </w:rPr>
+        <w:t>externalSchedulingEvent</w:t>
+      </w:r>
+      <w:r>
+        <w:rPr>
+          <w:rFonts w:ascii="Arial Unicode MS" w:hAnsi="Arial Unicode MS" w:eastAsia="Arial Unicode MS" w:hint="eastAsia"/>
+          <w:color w:val="20242A"/>
+          <w:sz w:val="21"/>
+          <w:lang w:val="en-US" w:eastAsia="zh-CN"/>
+        </w:rPr>
+        <w:t xml:space="preserve"> 处理提前唤醒：SystemC 一侧插入更早的 gem5 事件后，必须通知 adapter 重新检查队列，不能继续等原来的截止时间。同一时间戳内还涉及 gem5 事件优先级和 SystemC delta cycle，不能把它简化为任意排列的同时执行。</w:t>
+      </w:r>
+    </w:p>
+    <w:p>
+      <w:r>
+        <w:rPr>
+          <w:rFonts w:ascii="Arial Unicode MS" w:hAnsi="Arial Unicode MS" w:eastAsia="Arial Unicode MS" w:hint="eastAsia"/>
+          <w:color w:val="20242A"/>
+          <w:sz w:val="21"/>
+          <w:lang w:val="en-US" w:eastAsia="zh-CN"/>
+        </w:rPr>
+        <w:t xml:space="preserve">共享时间轴也不意味着任意时刻的 </w:t>
+      </w:r>
+      <w:r>
+        <w:rPr>
+          <w:rFonts w:ascii="Menlo" w:hAnsi="Menlo" w:eastAsia="Arial Unicode MS" w:hint="eastAsia"/>
+          <w:color w:val="204E79"/>
+          <w:sz w:val="20"/>
+          <w:lang w:val="en-US" w:eastAsia="zh-CN"/>
+        </w:rPr>
+        <w:t>gem5::curTick()</w:t>
+      </w:r>
+      <w:r>
+        <w:rPr>
+          <w:rFonts w:ascii="Arial Unicode MS" w:hAnsi="Arial Unicode MS" w:eastAsia="Arial Unicode MS" w:hint="eastAsia"/>
+          <w:color w:val="20242A"/>
+          <w:sz w:val="21"/>
+          <w:lang w:val="en-US" w:eastAsia="zh-CN"/>
+        </w:rPr>
+        <w:t xml:space="preserve"> 都与 </w:t>
+      </w:r>
+      <w:r>
+        <w:rPr>
+          <w:rFonts w:ascii="Menlo" w:hAnsi="Menlo" w:eastAsia="Arial Unicode MS" w:hint="eastAsia"/>
+          <w:color w:val="204E79"/>
+          <w:sz w:val="20"/>
+          <w:lang w:val="en-US" w:eastAsia="zh-CN"/>
+        </w:rPr>
+        <w:t>sc_time_stamp()</w:t>
+      </w:r>
+      <w:r>
+        <w:rPr>
+          <w:rFonts w:ascii="Arial Unicode MS" w:hAnsi="Arial Unicode MS" w:eastAsia="Arial Unicode MS" w:hint="eastAsia"/>
+          <w:color w:val="20242A"/>
+          <w:sz w:val="21"/>
+          <w:lang w:val="en-US" w:eastAsia="zh-CN"/>
+        </w:rPr>
+        <w:t xml:space="preserve"> 相等。当 SystemC 在两个 gem5 事件之间运行时，gem5 的当前 tick 可以暂时落后；adapter 在处理事件时通过 </w:t>
+      </w:r>
+      <w:r>
+        <w:rPr>
+          <w:rFonts w:ascii="Menlo" w:hAnsi="Menlo" w:eastAsia="Arial Unicode MS" w:hint="eastAsia"/>
+          <w:color w:val="204E79"/>
+          <w:sz w:val="20"/>
+          <w:lang w:val="en-US" w:eastAsia="zh-CN"/>
+        </w:rPr>
+        <w:t>catchup()</w:t>
+      </w:r>
+      <w:r>
+        <w:rPr>
+          <w:rFonts w:ascii="Arial Unicode MS" w:hAnsi="Arial Unicode MS" w:eastAsia="Arial Unicode MS" w:hint="eastAsia"/>
+          <w:color w:val="20242A"/>
+          <w:sz w:val="21"/>
+          <w:lang w:val="en-US" w:eastAsia="zh-CN"/>
+        </w:rPr>
+        <w:t xml:space="preserve"> 对齐。后续 Bridge 从 SystemC 调回 gem5、安排新事件前，也需要遵循这一时间对齐与通知约定。</w:t>
       </w:r>
     </w:p>
     <w:p>
@@ -1184,12 +1389,21 @@
     <w:p>
       <w:r>
         <w:rPr>
+          <w:rFonts w:ascii="Arial Unicode MS" w:hAnsi="Arial Unicode MS" w:eastAsia="Arial Unicode MS" w:hint="eastAsia"/>
+          <w:color w:val="20242A"/>
+          <w:sz w:val="21"/>
+          <w:lang w:val="en-US" w:eastAsia="zh-CN"/>
+        </w:rPr>
+        <w:t xml:space="preserve">示例先用 </w:t>
+      </w:r>
+      <w:r>
+        <w:rPr>
           <w:rFonts w:ascii="Menlo" w:hAnsi="Menlo" w:eastAsia="Arial Unicode MS" w:hint="eastAsia"/>
           <w:color w:val="204E79"/>
           <w:sz w:val="20"/>
           <w:lang w:val="en-US" w:eastAsia="zh-CN"/>
         </w:rPr>
-        <w:t>CxxConfigManager</w:t>
+        <w:t>findAllObjects()</w:t>
       </w:r>
       <w:r>
         <w:rPr>
@@ -1198,7 +1412,7 @@
           <w:sz w:val="21"/>
           <w:lang w:val="en-US" w:eastAsia="zh-CN"/>
         </w:rPr>
-        <w:t xml:space="preserve"> 根据 </w:t>
+        <w:t xml:space="preserve"> 创建模型对象，再逐个调用 </w:t>
       </w:r>
       <w:r>
         <w:rPr>
@@ -1207,7 +1421,7 @@
           <w:sz w:val="20"/>
           <w:lang w:val="en-US" w:eastAsia="zh-CN"/>
         </w:rPr>
-        <w:t>config.ini</w:t>
+        <w:t>bindObjectPorts()</w:t>
       </w:r>
       <w:r>
         <w:rPr>
@@ -1216,7 +1430,7 @@
           <w:sz w:val="21"/>
           <w:lang w:val="en-US" w:eastAsia="zh-CN"/>
         </w:rPr>
-        <w:t xml:space="preserve"> 查找并实例化 CPU、总线、内存控制器、workload 和进程对象。后续加入外部端口时，需要在 </w:t>
+        <w:t xml:space="preserve">，最后调用 </w:t>
       </w:r>
       <w:r>
         <w:rPr>
@@ -1225,7 +1439,7 @@
           <w:sz w:val="20"/>
           <w:lang w:val="en-US" w:eastAsia="zh-CN"/>
         </w:rPr>
-        <w:t>instantiate()</w:t>
+        <w:t>instantiate(false)</w:t>
       </w:r>
       <w:r>
         <w:rPr>
@@ -1234,7 +1448,79 @@
           <w:sz w:val="21"/>
           <w:lang w:val="en-US" w:eastAsia="zh-CN"/>
         </w:rPr>
-        <w:t xml:space="preserve"> 之前完成端口绑定，否则 SimObject 初始化阶段可能报告端口未连接。</w:t>
+        <w:t xml:space="preserve"> 完成 </w:t>
+      </w:r>
+      <w:r>
+        <w:rPr>
+          <w:rFonts w:ascii="Menlo" w:hAnsi="Menlo" w:eastAsia="Arial Unicode MS" w:hint="eastAsia"/>
+          <w:color w:val="204E79"/>
+          <w:sz w:val="20"/>
+          <w:lang w:val="en-US" w:eastAsia="zh-CN"/>
+        </w:rPr>
+        <w:t>init()</w:t>
+      </w:r>
+      <w:r>
+        <w:rPr>
+          <w:rFonts w:ascii="Arial Unicode MS" w:hAnsi="Arial Unicode MS" w:eastAsia="Arial Unicode MS" w:hint="eastAsia"/>
+          <w:color w:val="20242A"/>
+          <w:sz w:val="21"/>
+          <w:lang w:val="en-US" w:eastAsia="zh-CN"/>
+        </w:rPr>
+        <w:t>、统计和 probe 注册。</w:t>
+      </w:r>
+      <w:r>
+        <w:rPr>
+          <w:rFonts w:ascii="Menlo" w:hAnsi="Menlo" w:eastAsia="Arial Unicode MS" w:hint="eastAsia"/>
+          <w:color w:val="204E79"/>
+          <w:sz w:val="20"/>
+          <w:lang w:val="en-US" w:eastAsia="zh-CN"/>
+        </w:rPr>
+        <w:t>false</w:t>
+      </w:r>
+      <w:r>
+        <w:rPr>
+          <w:rFonts w:ascii="Arial Unicode MS" w:hAnsi="Arial Unicode MS" w:eastAsia="Arial Unicode MS" w:hint="eastAsia"/>
+          <w:color w:val="20242A"/>
+          <w:sz w:val="21"/>
+          <w:lang w:val="en-US" w:eastAsia="zh-CN"/>
+        </w:rPr>
+        <w:t xml:space="preserve"> 表示对象和端口已经准备好。默认的 </w:t>
+      </w:r>
+      <w:r>
+        <w:rPr>
+          <w:rFonts w:ascii="Menlo" w:hAnsi="Menlo" w:eastAsia="Arial Unicode MS" w:hint="eastAsia"/>
+          <w:color w:val="204E79"/>
+          <w:sz w:val="20"/>
+          <w:lang w:val="en-US" w:eastAsia="zh-CN"/>
+        </w:rPr>
+        <w:t>instantiate()</w:t>
+      </w:r>
+      <w:r>
+        <w:rPr>
+          <w:rFonts w:ascii="Arial Unicode MS" w:hAnsi="Arial Unicode MS" w:eastAsia="Arial Unicode MS" w:hint="eastAsia"/>
+          <w:color w:val="20242A"/>
+          <w:sz w:val="21"/>
+          <w:lang w:val="en-US" w:eastAsia="zh-CN"/>
+        </w:rPr>
+        <w:t xml:space="preserve"> 会自行完成对象创建与端口绑定；后续若手动连接外部端口，则必须在 SimObject 的 </w:t>
+      </w:r>
+      <w:r>
+        <w:rPr>
+          <w:rFonts w:ascii="Menlo" w:hAnsi="Menlo" w:eastAsia="Arial Unicode MS" w:hint="eastAsia"/>
+          <w:color w:val="204E79"/>
+          <w:sz w:val="20"/>
+          <w:lang w:val="en-US" w:eastAsia="zh-CN"/>
+        </w:rPr>
+        <w:t>init()</w:t>
+      </w:r>
+      <w:r>
+        <w:rPr>
+          <w:rFonts w:ascii="Arial Unicode MS" w:hAnsi="Arial Unicode MS" w:eastAsia="Arial Unicode MS" w:hint="eastAsia"/>
+          <w:color w:val="20242A"/>
+          <w:sz w:val="21"/>
+          <w:lang w:val="en-US" w:eastAsia="zh-CN"/>
+        </w:rPr>
+        <w:t xml:space="preserve"> 前完成，避免未连接错误或重复绑定。</w:t>
       </w:r>
     </w:p>
     <w:p>
@@ -1315,6 +1601,15 @@
     <w:p>
       <w:r>
         <w:rPr>
+          <w:rFonts w:ascii="Arial Unicode MS" w:hAnsi="Arial Unicode MS" w:eastAsia="Arial Unicode MS" w:hint="eastAsia"/>
+          <w:color w:val="20242A"/>
+          <w:sz w:val="21"/>
+          <w:lang w:val="en-US" w:eastAsia="zh-CN"/>
+        </w:rPr>
+        <w:t xml:space="preserve">调用 </w:t>
+      </w:r>
+      <w:r>
+        <w:rPr>
           <w:rFonts w:ascii="Menlo" w:hAnsi="Menlo" w:eastAsia="Arial Unicode MS" w:hint="eastAsia"/>
           <w:color w:val="204E79"/>
           <w:sz w:val="20"/>
@@ -1329,7 +1624,7 @@
           <w:sz w:val="21"/>
           <w:lang w:val="en-US" w:eastAsia="zh-CN"/>
         </w:rPr>
-        <w:t xml:space="preserve"> 启动 SystemC kernel。</w:t>
+        <w:t xml:space="preserve"> 后，SystemC 先执行包括 </w:t>
       </w:r>
       <w:r>
         <w:rPr>
@@ -1338,7 +1633,7 @@
           <w:sz w:val="20"/>
           <w:lang w:val="en-US" w:eastAsia="zh-CN"/>
         </w:rPr>
-        <w:t>Gem5Host</w:t>
+        <w:t>end_of_elaboration()</w:t>
       </w:r>
       <w:r>
         <w:rPr>
@@ -1347,7 +1642,25 @@
           <w:sz w:val="21"/>
           <w:lang w:val="en-US" w:eastAsia="zh-CN"/>
         </w:rPr>
-        <w:t xml:space="preserve"> 内部线程调用 </w:t>
+        <w:t xml:space="preserve"> 在内的启动回调，再进入进程调度。</w:t>
+      </w:r>
+      <w:r>
+        <w:rPr>
+          <w:rFonts w:ascii="Menlo" w:hAnsi="Menlo" w:eastAsia="Arial Unicode MS" w:hint="eastAsia"/>
+          <w:color w:val="204E79"/>
+          <w:sz w:val="20"/>
+          <w:lang w:val="en-US" w:eastAsia="zh-CN"/>
+        </w:rPr>
+        <w:t>Gem5Host</w:t>
+      </w:r>
+      <w:r>
+        <w:rPr>
+          <w:rFonts w:ascii="Arial Unicode MS" w:hAnsi="Arial Unicode MS" w:eastAsia="Arial Unicode MS" w:hint="eastAsia"/>
+          <w:color w:val="20242A"/>
+          <w:sz w:val="21"/>
+          <w:lang w:val="en-US" w:eastAsia="zh-CN"/>
+        </w:rPr>
+        <w:t xml:space="preserve"> 内部线程调用有 tick 上限的 </w:t>
       </w:r>
       <w:r>
         <w:rPr>
@@ -1408,7 +1721,7 @@
           <w:sz w:val="21"/>
           <w:lang w:val="en-US" w:eastAsia="zh-CN"/>
         </w:rPr>
-        <w:t xml:space="preserve">。第一章没有外部请求，可以直接调用 </w:t>
+        <w:t xml:space="preserve">。第一章没有外部 NPU 请求，因此检查退出原因、退出码和退出时的时间对齐后就调用 </w:t>
       </w:r>
       <w:r>
         <w:rPr>
@@ -1426,7 +1739,36 @@
           <w:sz w:val="21"/>
           <w:lang w:val="en-US" w:eastAsia="zh-CN"/>
         </w:rPr>
-        <w:t>。等我们加入 DMA 和异步 Engine 后，Guest 退出并不一定代表所有数据已经写回，届时必须先禁止新的通知、等待在途请求 drain，再停止 SystemC。</w:t>
+        <w:t>，并未执行完整系统 drain。超时事件也可能带有退出码 0，不能只用退出码判断成功。</w:t>
+      </w:r>
+    </w:p>
+    <w:p>
+      <w:r>
+        <w:rPr>
+          <w:rFonts w:ascii="Arial Unicode MS" w:hAnsi="Arial Unicode MS" w:eastAsia="Arial Unicode MS" w:hint="eastAsia"/>
+          <w:color w:val="20242A"/>
+          <w:sz w:val="21"/>
+          <w:lang w:val="en-US" w:eastAsia="zh-CN"/>
+        </w:rPr>
+        <w:t xml:space="preserve">加入 DMA 和异步 Engine 后，应先停止接受新工作，保留在途请求所需的完成回调并继续推进事件，待请求排空后再停止仿真。不能先屏蔽全部通知，否则 drain 可能永远无法结束。应用级请求排空与 gem5 </w:t>
+      </w:r>
+      <w:r>
+        <w:rPr>
+          <w:rFonts w:ascii="Menlo" w:hAnsi="Menlo" w:eastAsia="Arial Unicode MS" w:hint="eastAsia"/>
+          <w:color w:val="204E79"/>
+          <w:sz w:val="20"/>
+          <w:lang w:val="en-US" w:eastAsia="zh-CN"/>
+        </w:rPr>
+        <w:t>DrainManager</w:t>
+      </w:r>
+      <w:r>
+        <w:rPr>
+          <w:rFonts w:ascii="Arial Unicode MS" w:hAnsi="Arial Unicode MS" w:eastAsia="Arial Unicode MS" w:hint="eastAsia"/>
+          <w:color w:val="20242A"/>
+          <w:sz w:val="21"/>
+          <w:lang w:val="en-US" w:eastAsia="zh-CN"/>
+        </w:rPr>
+        <w:t xml:space="preserve"> 的协议也需要分别处理。</w:t>
       </w:r>
     </w:p>
     <w:p>
@@ -1462,7 +1804,7 @@
           <w:sz w:val="21"/>
           <w:lang w:val="en-US" w:eastAsia="zh-CN"/>
         </w:rPr>
-        <w:t>本文使用以下版本作为已验证基线：</w:t>
+        <w:t>本文选用以下目标依赖版本。当前运行验证来自 macOS arm64 上已有的 gem5 构建和 SystemC 2.3.4；尚未完成官方干净源码在 Linux/macOS 上的全量构建验证，因此下表不是已通过测试的跨平台兼容矩阵：</w:t>
       </w:r>
     </w:p>
     <w:tbl>
@@ -2076,7 +2418,7 @@
           <w:sz w:val="21"/>
           <w:lang w:val="en-US" w:eastAsia="zh-CN"/>
         </w:rPr>
-        <w:t xml:space="preserve">仓库没有复制 gem5 或 SystemC 源码。脚本会下载固定版本的 gem5；SystemC 建议通过系统包管理器安装，或者自行编译后设置 </w:t>
+        <w:t xml:space="preserve">仓库没有复制 gem5 或 SystemC 源码。脚本会下载固定版本的 gem5；SystemC 建议安装 2.3.4，或者自行编译后设置 </w:t>
       </w:r>
       <w:r>
         <w:rPr>
@@ -2086,6 +2428,35 @@
           <w:lang w:val="en-US" w:eastAsia="zh-CN"/>
         </w:rPr>
         <w:t>SYSTEMC_HOME</w:t>
+      </w:r>
+      <w:r>
+        <w:rPr>
+          <w:rFonts w:ascii="Arial Unicode MS" w:hAnsi="Arial Unicode MS" w:eastAsia="Arial Unicode MS" w:hint="eastAsia"/>
+          <w:color w:val="20242A"/>
+          <w:sz w:val="21"/>
+          <w:lang w:val="en-US" w:eastAsia="zh-CN"/>
+        </w:rPr>
+        <w:t>。包管理器当前默认版本可能已更新，不能假定直接安装就一定得到 2.3.4。</w:t>
+      </w:r>
+    </w:p>
+    <w:p>
+      <w:r>
+        <w:rPr>
+          <w:rFonts w:ascii="Arial Unicode MS" w:hAnsi="Arial Unicode MS" w:eastAsia="Arial Unicode MS" w:hint="eastAsia"/>
+          <w:color w:val="20242A"/>
+          <w:sz w:val="21"/>
+          <w:lang w:val="en-US" w:eastAsia="zh-CN"/>
+        </w:rPr>
+        <w:t xml:space="preserve">脚本不是系统依赖的一键安装器。开始前需要 C/C++ 工具链、CMake、curl、tar、Python 的 venv 与开发文件，以及 zlib 开发文件；其他可选组件按 gem5 构建输出处理。Linux 软件包名称和编译器要求请对照文末 gem5 构建文档。Host 当前使用 C++17，SystemC 库的 C++ 标准与 ABI 必须匹配。测试范围与剩余验证项记录在仓库 </w:t>
+      </w:r>
+      <w:r>
+        <w:rPr>
+          <w:rFonts w:ascii="Menlo" w:hAnsi="Menlo" w:eastAsia="Arial Unicode MS" w:hint="eastAsia"/>
+          <w:color w:val="204E79"/>
+          <w:sz w:val="20"/>
+          <w:lang w:val="en-US" w:eastAsia="zh-CN"/>
+        </w:rPr>
+        <w:t>docs/VALIDATION.md</w:t>
       </w:r>
       <w:r>
         <w:rPr>
@@ -2206,7 +2577,43 @@
           <w:sz w:val="21"/>
           <w:lang w:val="en-US" w:eastAsia="zh-CN"/>
         </w:rPr>
-        <w:t>它会创建一个周期为 1 ns 的时钟，并在若干个上升沿后停止。这个例子很小，但能够优先排除 SystemC 安装、C++ ABI 和动态库路径问题。</w:t>
+        <w:t xml:space="preserve">它会创建一个周期为 1 ns 的时钟，在第 8 个上升沿停止。默认 </w:t>
+      </w:r>
+      <w:r>
+        <w:rPr>
+          <w:rFonts w:ascii="Menlo" w:hAnsi="Menlo" w:eastAsia="Arial Unicode MS" w:hint="eastAsia"/>
+          <w:color w:val="204E79"/>
+          <w:sz w:val="20"/>
+          <w:lang w:val="en-US" w:eastAsia="zh-CN"/>
+        </w:rPr>
+        <w:t>sc_clock</w:t>
+      </w:r>
+      <w:r>
+        <w:rPr>
+          <w:rFonts w:ascii="Arial Unicode MS" w:hAnsi="Arial Unicode MS" w:eastAsia="Arial Unicode MS" w:hint="eastAsia"/>
+          <w:color w:val="20242A"/>
+          <w:sz w:val="21"/>
+          <w:lang w:val="en-US" w:eastAsia="zh-CN"/>
+        </w:rPr>
+        <w:t xml:space="preserve"> 在 0 ns 产生第一个上升沿，所以预期停止于 7 ns。</w:t>
+      </w:r>
+      <w:r>
+        <w:rPr>
+          <w:rFonts w:ascii="Menlo" w:hAnsi="Menlo" w:eastAsia="Arial Unicode MS" w:hint="eastAsia"/>
+          <w:color w:val="204E79"/>
+          <w:sz w:val="20"/>
+          <w:lang w:val="en-US" w:eastAsia="zh-CN"/>
+        </w:rPr>
+        <w:t>dont_initialize()</w:t>
+      </w:r>
+      <w:r>
+        <w:rPr>
+          <w:rFonts w:ascii="Arial Unicode MS" w:hAnsi="Arial Unicode MS" w:eastAsia="Arial Unicode MS" w:hint="eastAsia"/>
+          <w:color w:val="20242A"/>
+          <w:sz w:val="21"/>
+          <w:lang w:val="en-US" w:eastAsia="zh-CN"/>
+        </w:rPr>
+        <w:t xml:space="preserve"> 只禁止进程初始化执行，不会屏蔽 0 时刻的真实时钟事件。示例同时检查边沿数和停止时间。</w:t>
       </w:r>
     </w:p>
     <w:p>
@@ -2766,7 +3173,7 @@
           <w:sz w:val="21"/>
           <w:lang w:val="en-US" w:eastAsia="zh-CN"/>
         </w:rPr>
-        <w:t>gem5 tick 与 SystemC 时间保持一致。</w:t>
+        <w:t>退出事件处的 gem5 tick 与 SystemC 时间一致，SystemC 时钟边沿持续推进。</w:t>
       </w:r>
     </w:p>
     <w:p>
@@ -2782,6 +3189,53 @@
           <w:lang w:val="en-US" w:eastAsia="zh-CN"/>
         </w:rPr>
         <w:t>Guest 退出能够正常终止整个联合仿真进程。</w:t>
+      </w:r>
+    </w:p>
+    <w:p>
+      <w:r>
+        <w:rPr>
+          <w:rFonts w:ascii="Arial Unicode MS" w:hAnsi="Arial Unicode MS" w:eastAsia="Arial Unicode MS" w:hint="eastAsia"/>
+          <w:color w:val="20242A"/>
+          <w:sz w:val="21"/>
+          <w:lang w:val="en-US" w:eastAsia="zh-CN"/>
+        </w:rPr>
+        <w:t xml:space="preserve">示例默认最多执行 </w:t>
+      </w:r>
+      <w:r>
+        <w:rPr>
+          <w:rFonts w:ascii="Menlo" w:hAnsi="Menlo" w:eastAsia="Arial Unicode MS" w:hint="eastAsia"/>
+          <w:color w:val="204E79"/>
+          <w:sz w:val="20"/>
+          <w:lang w:val="en-US" w:eastAsia="zh-CN"/>
+        </w:rPr>
+        <w:t>10^9</w:t>
+      </w:r>
+      <w:r>
+        <w:rPr>
+          <w:rFonts w:ascii="Arial Unicode MS" w:hAnsi="Arial Unicode MS" w:eastAsia="Arial Unicode MS" w:hint="eastAsia"/>
+          <w:color w:val="20242A"/>
+          <w:sz w:val="21"/>
+          <w:lang w:val="en-US" w:eastAsia="zh-CN"/>
+        </w:rPr>
+        <w:t xml:space="preserve"> tick，即 1 ms 模拟时间；可通过第二个参数覆盖。模拟时间上限不等于墙钟超时，CI 仍应设置进程超时。输出中的 </w:t>
+      </w:r>
+      <w:r>
+        <w:rPr>
+          <w:rFonts w:ascii="Menlo" w:hAnsi="Menlo" w:eastAsia="Arial Unicode MS" w:hint="eastAsia"/>
+          <w:color w:val="204E79"/>
+          <w:sz w:val="20"/>
+          <w:lang w:val="en-US" w:eastAsia="zh-CN"/>
+        </w:rPr>
+        <w:t>npu_clock_edges</w:t>
+      </w:r>
+      <w:r>
+        <w:rPr>
+          <w:rFonts w:ascii="Arial Unicode MS" w:hAnsi="Arial Unicode MS" w:eastAsia="Arial Unicode MS" w:hint="eastAsia"/>
+          <w:color w:val="20242A"/>
+          <w:sz w:val="21"/>
+          <w:lang w:val="en-US" w:eastAsia="zh-CN"/>
+        </w:rPr>
+        <w:t xml:space="preserve"> 包含 0 时刻上升沿，不是已完成计算周期或 NPU 利用率。最终时间相等只检查一个同步点，不能替代后续双向 Bridge、提前唤醒和反压测试。</w:t>
       </w:r>
     </w:p>
     <w:p>
@@ -3313,7 +3767,7 @@
           <w:sz w:val="21"/>
           <w:lang w:val="en-US" w:eastAsia="zh-CN"/>
         </w:rPr>
-        <w:t>当前最小系统尚未包含 NPU 命令、DMA、Shared Memory 或计算 Engine，因此不能用于评估 NPU 性能。它证明的是联合仿真生命周期和时间协调能够工作。</w:t>
+        <w:t>当前最小系统尚未包含 NPU 命令、DMA、Shared Memory 或计算 Engine，因此不能用于评估 NPU 性能。它验证的是当前 Hello World 路径下的启动、退出和退出时的时间对齐，不足以证明任意跨框架交互的时序正确性。</w:t>
       </w:r>
     </w:p>
     <w:p>
@@ -3421,16 +3875,17 @@
           <w:sz w:val="21"/>
           <w:lang w:val="en-US" w:eastAsia="zh-CN"/>
         </w:rPr>
-        <w:t>3. gem5 within SystemC 示例：</w:t>
-      </w:r>
-      <w:r>
-        <w:rPr>
-          <w:rFonts w:ascii="Menlo" w:hAnsi="Menlo" w:eastAsia="Arial Unicode MS" w:hint="eastAsia"/>
-          <w:color w:val="204E79"/>
-          <w:sz w:val="20"/>
-          <w:lang w:val="en-US" w:eastAsia="zh-CN"/>
-        </w:rPr>
-        <w:t>util/systemc/gem5_within_systemc</w:t>
+        <w:t>3. gem5 within SystemC adapter 源码：</w:t>
+      </w:r>
+      <w:r>
+        <w:rPr>
+          <w:rFonts w:ascii="Arial Unicode MS" w:hAnsi="Arial Unicode MS" w:eastAsia="Arial Unicode MS" w:hint="eastAsia"/>
+          <w:color w:val="0563C1"/>
+          <w:sz w:val="21"/>
+          <w:u w:val="single"/>
+          <w:lang w:val="en-US" w:eastAsia="zh-CN"/>
+        </w:rPr>
+        <w:t>sc_module.cc（https://github.com/gem5/gem5/blob/v25.1.0.1/util/systemc/gem5_within_systemc/sc_module.cc）</w:t>
       </w:r>
     </w:p>
     <w:p>
@@ -3481,6 +3936,81 @@
           <w:lang w:val="en-US" w:eastAsia="zh-CN"/>
         </w:rPr>
         <w:t>https://github.com/accellera-official/systemc/releases/tag/2.3.4</w:t>
+      </w:r>
+    </w:p>
+    <w:p>
+      <w:pPr>
+        <w:spacing w:after="80"/>
+        <w:ind w:left="255" w:hanging="255"/>
+      </w:pPr>
+      <w:r>
+        <w:rPr>
+          <w:rFonts w:ascii="Arial Unicode MS" w:hAnsi="Arial Unicode MS" w:eastAsia="Arial Unicode MS" w:hint="eastAsia"/>
+          <w:color w:val="20242A"/>
+          <w:sz w:val="21"/>
+          <w:lang w:val="en-US" w:eastAsia="zh-CN"/>
+        </w:rPr>
+        <w:t>6. gem5 构建依赖：</w:t>
+      </w:r>
+      <w:r>
+        <w:rPr>
+          <w:rFonts w:ascii="Arial Unicode MS" w:hAnsi="Arial Unicode MS" w:eastAsia="Arial Unicode MS" w:hint="eastAsia"/>
+          <w:color w:val="0563C1"/>
+          <w:sz w:val="21"/>
+          <w:u w:val="single"/>
+          <w:lang w:val="en-US" w:eastAsia="zh-CN"/>
+        </w:rPr>
+        <w:t>Building gem5（https://www.gem5.org/documentation/general_docs/building）</w:t>
+      </w:r>
+    </w:p>
+    <w:p>
+      <w:pPr>
+        <w:spacing w:after="80"/>
+        <w:ind w:left="255" w:hanging="255"/>
+      </w:pPr>
+      <w:r>
+        <w:rPr>
+          <w:rFonts w:ascii="Arial Unicode MS" w:hAnsi="Arial Unicode MS" w:eastAsia="Arial Unicode MS" w:hint="eastAsia"/>
+          <w:color w:val="20242A"/>
+          <w:sz w:val="21"/>
+          <w:lang w:val="en-US" w:eastAsia="zh-CN"/>
+        </w:rPr>
+        <w:t>7. gem5 C++ 生命周期：</w:t>
+      </w:r>
+      <w:r>
+        <w:rPr>
+          <w:rFonts w:ascii="Arial Unicode MS" w:hAnsi="Arial Unicode MS" w:eastAsia="Arial Unicode MS" w:hint="eastAsia"/>
+          <w:color w:val="0563C1"/>
+          <w:sz w:val="21"/>
+          <w:u w:val="single"/>
+          <w:lang w:val="en-US" w:eastAsia="zh-CN"/>
+        </w:rPr>
+        <w:t>cxx_manager.cc（https://github.com/gem5/gem5/blob/v25.1.0.1/src/sim/cxx_manager.cc）</w:t>
+      </w:r>
+    </w:p>
+    <w:p>
+      <w:pPr>
+        <w:spacing w:after="80"/>
+        <w:ind w:left="255" w:hanging="255"/>
+      </w:pPr>
+      <w:r>
+        <w:rPr>
+          <w:rFonts w:ascii="Arial Unicode MS" w:hAnsi="Arial Unicode MS" w:eastAsia="Arial Unicode MS" w:hint="eastAsia"/>
+          <w:color w:val="20242A"/>
+          <w:sz w:val="21"/>
+          <w:lang w:val="en-US" w:eastAsia="zh-CN"/>
+        </w:rPr>
+        <w:t>8. 本文配套代码、提纲与验证记录：</w:t>
+      </w:r>
+      <w:r>
+        <w:rPr>
+          <w:rFonts w:ascii="Arial Unicode MS" w:hAnsi="Arial Unicode MS" w:eastAsia="Arial Unicode MS" w:hint="eastAsia"/>
+          <w:color w:val="0563C1"/>
+          <w:sz w:val="21"/>
+          <w:u w:val="single"/>
+          <w:lang w:val="en-US" w:eastAsia="zh-CN"/>
+        </w:rPr>
+        <w:t>https://github.com/Ch1-n/npu-system-modeling</w:t>
       </w:r>
     </w:p>
     <w:sectPr>

</xml_diff>

<commit_message>
Rewrite chapter 1 as a personal technical article
</commit_message>
<xml_diff>
--- a/docs/zhihu/chapter-01-gem5-systemc-foundation.docx
+++ b/docs/zhihu/chapter-01-gem5-systemc-foundation.docx
@@ -30,7 +30,7 @@
           <w:sz w:val="22"/>
           <w:lang w:val="en-US" w:eastAsia="zh-CN"/>
         </w:rPr>
-        <w:t>NPU 系统建模与联合仿真系列第一章</w:t>
+        <w:t>NPU 系统建模与联合仿真系列第一篇</w:t>
       </w:r>
     </w:p>
     <w:p>
@@ -41,7 +41,7 @@
           <w:sz w:val="21"/>
           <w:lang w:val="en-US" w:eastAsia="zh-CN"/>
         </w:rPr>
-        <w:t>实现一个算子模型并不难，真正困难的是回答下面这些系统问题：谁执行驱动程序，谁负责推进时间，CPU 与 NPU 如何交换命令和数据，访存延迟从哪里产生，仿真结束时还有没有请求留在队列里。</w:t>
+        <w:t>这段时间，我在做一个基于 gem5 和 SystemC 的 NPU 系统仿真项目。打算借这个系列，把搭建环境、连接 CPU、处理访存和调度的过程整理下来，也把其中一些通用代码单独放出来，方便大家动手试一试。</w:t>
       </w:r>
     </w:p>
     <w:p>
@@ -52,7 +52,7 @@
           <w:sz w:val="21"/>
           <w:lang w:val="en-US" w:eastAsia="zh-CN"/>
         </w:rPr>
-        <w:t>一个不含时序的 C++ 矩阵乘函数主要用于验证计算结果；仅有独立 NPU 模型时，也缺少执行 Guest 软件的 CPU 和配套存储系统。SystemC 本身可以描述这些模块，但本文选择复用 gem5 的 CPU 与存储模型。我们先搭建整个系列的底座：让 gem5 中的 RISC-V CPU 和 SystemC 中的硬件模型运行在同一个进程、同一条仿真时间轴上。</w:t>
+        <w:t>先从一个具体问题说起。假设已经有了矩阵乘模型，输入数据能算出正确结果，接下来想知道：DMA 还在搬数据时，计算单元能不能开始工作？CPU 提交命令后，是一直等着，还是可以继续执行？如果再增加一个计算单元，性能会不会被内存带宽卡住？</w:t>
       </w:r>
     </w:p>
     <w:p>
@@ -63,7 +63,48 @@
           <w:sz w:val="21"/>
           <w:lang w:val="en-US" w:eastAsia="zh-CN"/>
         </w:rPr>
-        <w:t>本章暂时不加入具体 NPU Engine。完成本章后，我们将得到一个可以继续扩展命令 Bridge、Shared Memory、DMA 和 Runtime 的最小联合仿真环境。</w:t>
+        <w:t>这些问题都需要把计算单元放进系统里看。这也是我选择 gem5 + SystemC 的原因：用 gem5 执行 CPU 上的软件，用 SystemC 描述 NPU 的内部模块，再把两边的时间协调起来。</w:t>
+      </w:r>
+    </w:p>
+    <w:p>
+      <w:r>
+        <w:rPr>
+          <w:rFonts w:ascii="Arial Unicode MS" w:hAnsi="Arial Unicode MS" w:eastAsia="Arial Unicode MS" w:hint="eastAsia"/>
+          <w:color w:val="20242A"/>
+          <w:sz w:val="21"/>
+          <w:lang w:val="en-US" w:eastAsia="zh-CN"/>
+        </w:rPr>
+        <w:t>第一篇先不放计算 Engine，只让 RISC-V CPU 跑一段 Hello World，同时让 SystemC 时钟正常运行。后面的命令接口、DMA 和 Runtime，都从这个小例子往上加。</w:t>
+      </w:r>
+    </w:p>
+    <w:p>
+      <w:r>
+        <w:rPr>
+          <w:rFonts w:ascii="Arial Unicode MS" w:hAnsi="Arial Unicode MS" w:eastAsia="Arial Unicode MS" w:hint="eastAsia"/>
+          <w:color w:val="20242A"/>
+          <w:sz w:val="21"/>
+          <w:lang w:val="en-US" w:eastAsia="zh-CN"/>
+        </w:rPr>
+        <w:t xml:space="preserve">配套代码在 </w:t>
+      </w:r>
+      <w:r>
+        <w:rPr>
+          <w:rFonts w:ascii="Arial Unicode MS" w:hAnsi="Arial Unicode MS" w:eastAsia="Arial Unicode MS" w:hint="eastAsia"/>
+          <w:color w:val="0563C1"/>
+          <w:sz w:val="21"/>
+          <w:u w:val="single"/>
+          <w:lang w:val="en-US" w:eastAsia="zh-CN"/>
+        </w:rPr>
+        <w:t>npu-system-modeling（https://github.com/Ch1-n/npu-system-modeling）</w:t>
+      </w:r>
+      <w:r>
+        <w:rPr>
+          <w:rFonts w:ascii="Arial Unicode MS" w:hAnsi="Arial Unicode MS" w:eastAsia="Arial Unicode MS" w:hint="eastAsia"/>
+          <w:color w:val="20242A"/>
+          <w:sz w:val="21"/>
+          <w:lang w:val="en-US" w:eastAsia="zh-CN"/>
+        </w:rPr>
+        <w:t>。图也保留了 Draw.io 源文件，可以下载修改。</w:t>
       </w:r>
     </w:p>
     <w:p>
@@ -77,7 +118,7 @@
           <w:sz w:val="26"/>
           <w:lang w:val="en-US" w:eastAsia="zh-CN"/>
         </w:rPr>
-        <w:t>一 为什么需要联合仿真</w:t>
+        <w:t>一 为什么选 gem5 和 SystemC</w:t>
       </w:r>
     </w:p>
     <w:p>
@@ -88,7 +129,7 @@
           <w:sz w:val="21"/>
           <w:lang w:val="en-US" w:eastAsia="zh-CN"/>
         </w:rPr>
-        <w:t>NPU 模型通常会经历功能模型、周期模型和 RTL 三个阶段。它们不是互相替代的关系，而是回答不同问题。</w:t>
+        <w:t>做 NPU 仿真时，功能模型、周期模型和 RTL 都会用到，只是看问题的角度不同。</w:t>
       </w:r>
     </w:p>
     <w:p>
@@ -155,7 +196,7 @@
           <w:sz w:val="21"/>
           <w:lang w:val="en-US" w:eastAsia="zh-CN"/>
         </w:rPr>
-        <w:t>功能模型关心结果是否正确。例如输入两个 FP16 矩阵，输出是否与 NumPy 或 ONNX Runtime 的参考结果一致。它适合快速验证算法、数据类型和算子组合，但通常不会告诉我们命令排队了多久，也不会告诉我们 Shared Memory 是否发生 bank conflict。</w:t>
+        <w:t>比如验证一次 FP16 矩阵乘，功能模型可以给出参考结果，检查数据类型、舍入和计算过程是否符合预期。但如果想知道这次运算花了多少周期，就要把流水延迟、队列、存储端口和等待时间也算进去。这些是周期模型要描述的东西。</w:t>
       </w:r>
     </w:p>
     <w:p>
@@ -166,7 +207,7 @@
           <w:sz w:val="21"/>
           <w:lang w:val="en-US" w:eastAsia="zh-CN"/>
         </w:rPr>
-        <w:t>周期模型关心数据在什么时候可用。它需要描述 FIFO 深度、模块吞吐率、流水延迟、端口冲突、反压和完成事件。它通常省略电路实现细节，运行速度也更适合早期架构探索；但时序精度取决于具体模型和校准情况，不能仅凭使用 C++、SystemC 或 RTL 来判定。RTL 仿真本身也不等于包含布局布线延迟的门级时序仿真。</w:t>
+        <w:t>再往下做到 RTL，才需要把寄存器、组合逻辑和逐周期握手落实成电路。架构还在调整时，我更希望能方便地修改队列深度、访存延迟或计算吞吐率，观察整个系统的变化，因此这个系列先围绕周期模型展开。</w:t>
       </w:r>
     </w:p>
     <w:p>
@@ -177,7 +218,7 @@
           <w:sz w:val="21"/>
           <w:lang w:val="en-US" w:eastAsia="zh-CN"/>
         </w:rPr>
-        <w:t>RTL 进一步描述寄存器、组合逻辑和逐周期握手，是综合、时序分析和芯片实现的基础。不过，在架构尚未稳定时直接使用 RTL 扫描大量参数，开发成本会很高。</w:t>
+        <w:t>SystemC 很适合组织这些硬件模块。时钟、FIFO、事件、多个模块之间的并行，都有现成的表达方式。不过，单独一个 NPU 模型还需要有人给它发命令。可以在 testbench 里写死一串请求，也可以让 CPU 执行程序来提交请求。后者能把软件侧的开销和行为一起带进来，所以这里接入 gem5，复用它的 RISC-V CPU 和存储系统模型。</w:t>
       </w:r>
     </w:p>
     <w:p>
@@ -188,78 +229,7 @@
           <w:sz w:val="21"/>
           <w:lang w:val="en-US" w:eastAsia="zh-CN"/>
         </w:rPr>
-        <w:t>本系列用 gem5 与 SystemC 构建周期级系统模型。两者接在一起不会自动获得周期精确性，仍需逐项定义和验证时序契约：</w:t>
-      </w:r>
-    </w:p>
-    <w:p>
-      <w:pPr>
-        <w:pStyle w:val="ListBullet"/>
-        <w:spacing w:after="60"/>
-      </w:pPr>
-      <w:r>
-        <w:rPr>
-          <w:rFonts w:ascii="Arial Unicode MS" w:hAnsi="Arial Unicode MS" w:eastAsia="Arial Unicode MS" w:hint="eastAsia"/>
-          <w:color w:val="20242A"/>
-          <w:sz w:val="21"/>
-          <w:lang w:val="en-US" w:eastAsia="zh-CN"/>
-        </w:rPr>
-        <w:t>gem5 负责执行 RISC-V Guest ELF，并提供可选的 CPU、cache 和内存系统模型。本章没有配置 cache；SE 使用模拟进程的地址映射，不是完整操作系统的页表遍历路径。</w:t>
-      </w:r>
-    </w:p>
-    <w:p>
-      <w:pPr>
-        <w:pStyle w:val="ListBullet"/>
-        <w:spacing w:after="60"/>
-      </w:pPr>
-      <w:r>
-        <w:rPr>
-          <w:rFonts w:ascii="Arial Unicode MS" w:hAnsi="Arial Unicode MS" w:eastAsia="Arial Unicode MS" w:hint="eastAsia"/>
-          <w:color w:val="20242A"/>
-          <w:sz w:val="21"/>
-          <w:lang w:val="en-US" w:eastAsia="zh-CN"/>
-        </w:rPr>
-        <w:t>SystemC 负责表达 NPU 内部模块、FIFO、端口、延迟、反压和多 Engine 并行。</w:t>
-      </w:r>
-    </w:p>
-    <w:p>
-      <w:pPr>
-        <w:pStyle w:val="ListBullet"/>
-        <w:spacing w:after="60"/>
-      </w:pPr>
-      <w:r>
-        <w:rPr>
-          <w:rFonts w:ascii="Arial Unicode MS" w:hAnsi="Arial Unicode MS" w:eastAsia="Arial Unicode MS" w:hint="eastAsia"/>
-          <w:color w:val="20242A"/>
-          <w:sz w:val="21"/>
-          <w:lang w:val="en-US" w:eastAsia="zh-CN"/>
-        </w:rPr>
-        <w:t>软件参考模型继续用于数值对比。</w:t>
-      </w:r>
-    </w:p>
-    <w:p>
-      <w:pPr>
-        <w:pStyle w:val="ListBullet"/>
-        <w:spacing w:after="60"/>
-      </w:pPr>
-      <w:r>
-        <w:rPr>
-          <w:rFonts w:ascii="Arial Unicode MS" w:hAnsi="Arial Unicode MS" w:eastAsia="Arial Unicode MS" w:hint="eastAsia"/>
-          <w:color w:val="20242A"/>
-          <w:sz w:val="21"/>
-          <w:lang w:val="en-US" w:eastAsia="zh-CN"/>
-        </w:rPr>
-        <w:t>RTL 在接口和微架构冻结后承担更精确的实现验证。</w:t>
-      </w:r>
-    </w:p>
-    <w:p>
-      <w:r>
-        <w:rPr>
-          <w:rFonts w:ascii="Arial Unicode MS" w:hAnsi="Arial Unicode MS" w:eastAsia="Arial Unicode MS" w:hint="eastAsia"/>
-          <w:color w:val="20242A"/>
-          <w:sz w:val="21"/>
-          <w:lang w:val="en-US" w:eastAsia="zh-CN"/>
-        </w:rPr>
-        <w:t>这套分工让我们可以在写出完整 RTL 之前，就观察一条 NPU 命令从 CPU 发出、进入队列、访问存储、完成计算并唤醒软件的全过程。</w:t>
+        <w:t>用上这两个工具，并不意味着模型自然就是“周期精确”的。比如把 DMA 简化成固定延迟后，这段延迟就不会反映真实的带宽竞争。模型省略了什么，后面分析性能时还得记着。</w:t>
       </w:r>
     </w:p>
     <w:p>
@@ -273,7 +243,7 @@
           <w:sz w:val="26"/>
           <w:lang w:val="en-US" w:eastAsia="zh-CN"/>
         </w:rPr>
-        <w:t>二 本系列要搭建什么系统</w:t>
+        <w:t>二 先分清 Host 和 Guest</w:t>
       </w:r>
     </w:p>
     <w:p>
@@ -284,7 +254,7 @@
           <w:sz w:val="21"/>
           <w:lang w:val="en-US" w:eastAsia="zh-CN"/>
         </w:rPr>
-        <w:t>最终系统由 Host 程序、RISC-V Guest、gem5 和 SystemC NPU 模型组成。</w:t>
+        <w:t>下面这张图是整个系列的结构。黄色框里的 NPU 模块会在后续文章中逐步加入，第一篇暂时只有时钟和一个计数模块。</w:t>
       </w:r>
     </w:p>
     <w:p>
@@ -351,7 +321,27 @@
           <w:sz w:val="21"/>
           <w:lang w:val="en-US" w:eastAsia="zh-CN"/>
         </w:rPr>
-        <w:t xml:space="preserve">Host 是在本机运行的 C++ 可执行程序。它包含 </w:t>
+        <w:t>图里有两种程序，编译和调试时要分清。</w:t>
+      </w:r>
+    </w:p>
+    <w:p>
+      <w:r>
+        <w:rPr>
+          <w:rFonts w:ascii="Arial Unicode MS" w:hAnsi="Arial Unicode MS" w:eastAsia="Arial Unicode MS" w:hint="eastAsia"/>
+          <w:b/>
+          <w:sz w:val="21"/>
+          <w:lang w:val="en-US" w:eastAsia="zh-CN"/>
+        </w:rPr>
+        <w:t>Host</w:t>
+      </w:r>
+      <w:r>
+        <w:rPr>
+          <w:rFonts w:ascii="Arial Unicode MS" w:hAnsi="Arial Unicode MS" w:eastAsia="Arial Unicode MS" w:hint="eastAsia"/>
+          <w:color w:val="20242A"/>
+          <w:sz w:val="21"/>
+          <w:lang w:val="en-US" w:eastAsia="zh-CN"/>
+        </w:rPr>
+        <w:t xml:space="preserve"> 是在电脑上直接运行的 C++ 程序，入口是 </w:t>
       </w:r>
       <w:r>
         <w:rPr>
@@ -369,7 +359,7 @@
           <w:sz w:val="21"/>
           <w:lang w:val="en-US" w:eastAsia="zh-CN"/>
         </w:rPr>
-        <w:t xml:space="preserve">，链接外部 SystemC 库和 </w:t>
+        <w:t xml:space="preserve">。它链接 SystemC 和 </w:t>
       </w:r>
       <w:r>
         <w:rPr>
@@ -387,10 +377,19 @@
           <w:sz w:val="21"/>
           <w:lang w:val="en-US" w:eastAsia="zh-CN"/>
         </w:rPr>
-        <w:t>，创建全部模型并启动仿真。</w:t>
+        <w:t>，负责创建模型、读取配置和启动仿真。</w:t>
       </w:r>
     </w:p>
     <w:p>
+      <w:r>
+        <w:rPr>
+          <w:rFonts w:ascii="Arial Unicode MS" w:hAnsi="Arial Unicode MS" w:eastAsia="Arial Unicode MS" w:hint="eastAsia"/>
+          <w:b/>
+          <w:sz w:val="21"/>
+          <w:lang w:val="en-US" w:eastAsia="zh-CN"/>
+        </w:rPr>
+        <w:t>Guest</w:t>
+      </w:r>
       <w:r>
         <w:rPr>
           <w:rFonts w:ascii="Arial Unicode MS" w:hAnsi="Arial Unicode MS" w:eastAsia="Arial Unicode MS" w:hint="eastAsia"/>
@@ -398,7 +397,7 @@
           <w:sz w:val="21"/>
           <w:lang w:val="en-US" w:eastAsia="zh-CN"/>
         </w:rPr>
-        <w:t xml:space="preserve">Guest 是由 gem5 中的 RISC-V CPU 执行的 ELF。后续章节中，Guest 会调用 Runtime、提交 NPU 命令并检查输出。Guest 不是 Host 的普通函数，Host 也不会直接调用 Guest 的 </w:t>
+        <w:t xml:space="preserve"> 是交给模拟 CPU 执行的 RISC-V ELF。后面写的 Runtime、测试程序都属于这一侧。Host 不会直接调用 Guest 的 </w:t>
       </w:r>
       <w:r>
         <w:rPr>
@@ -416,7 +415,7 @@
           <w:sz w:val="21"/>
           <w:lang w:val="en-US" w:eastAsia="zh-CN"/>
         </w:rPr>
-        <w:t>。gem5 会按照 ELF 装载规则建立进程地址空间、初始化栈和程序计数器，然后由模拟 CPU 取指执行。</w:t>
+        <w:t>：gem5 先装载 ELF、建立进程地址空间并初始化栈和 PC，再由模拟 CPU 取指执行。</w:t>
       </w:r>
     </w:p>
     <w:p>
@@ -427,7 +426,43 @@
           <w:sz w:val="21"/>
           <w:lang w:val="en-US" w:eastAsia="zh-CN"/>
         </w:rPr>
-        <w:t>SystemC NPU 位于 Host 进程内部。第一章只保留一个时钟和观察模块；第二章再加入命令 Bridge 与 Echo/Add 设备；之后逐步增加 Shared Memory、DMA、计算 Engine、同步和 Runtime。</w:t>
+        <w:t xml:space="preserve">所以，看到终端打印 </w:t>
+      </w:r>
+      <w:r>
+        <w:rPr>
+          <w:rFonts w:ascii="Menlo" w:hAnsi="Menlo" w:eastAsia="Arial Unicode MS" w:hint="eastAsia"/>
+          <w:color w:val="204E79"/>
+          <w:sz w:val="20"/>
+          <w:lang w:val="en-US" w:eastAsia="zh-CN"/>
+        </w:rPr>
+        <w:t>Hello world!</w:t>
+      </w:r>
+      <w:r>
+        <w:rPr>
+          <w:rFonts w:ascii="Arial Unicode MS" w:hAnsi="Arial Unicode MS" w:eastAsia="Arial Unicode MS" w:hint="eastAsia"/>
+          <w:color w:val="20242A"/>
+          <w:sz w:val="21"/>
+          <w:lang w:val="en-US" w:eastAsia="zh-CN"/>
+        </w:rPr>
+        <w:t xml:space="preserve"> 时，这句话应该来自 Guest 的执行结果，而不是 Host 里的一条 </w:t>
+      </w:r>
+      <w:r>
+        <w:rPr>
+          <w:rFonts w:ascii="Menlo" w:hAnsi="Menlo" w:eastAsia="Arial Unicode MS" w:hint="eastAsia"/>
+          <w:color w:val="204E79"/>
+          <w:sz w:val="20"/>
+          <w:lang w:val="en-US" w:eastAsia="zh-CN"/>
+        </w:rPr>
+        <w:t>printf</w:t>
+      </w:r>
+      <w:r>
+        <w:rPr>
+          <w:rFonts w:ascii="Arial Unicode MS" w:hAnsi="Arial Unicode MS" w:eastAsia="Arial Unicode MS" w:hint="eastAsia"/>
+          <w:color w:val="20242A"/>
+          <w:sz w:val="21"/>
+          <w:lang w:val="en-US" w:eastAsia="zh-CN"/>
+        </w:rPr>
+        <w:t>。</w:t>
       </w:r>
     </w:p>
     <w:p>
@@ -438,21 +473,21 @@
           <w:sz w:val="21"/>
           <w:lang w:val="en-US" w:eastAsia="zh-CN"/>
         </w:rPr>
-        <w:t>本文采用 gem5 syscall emulation，也就是 SE 模式。它可以执行用户态 RISC-V 程序，但没有启动 Linux 内核，因此不能把本文环境描述成完整 SoC 或 Linux 板级仿真。涉及驱动、中断控制器、页表和操作系统调度的问题，需要在后续改用 full-system 模式或 RTL 平台验证。</w:t>
+        <w:t>这里采用 gem5 的 SE 模式，即 syscall emulation。它能运行用户态 RISC-V 程序，把支持的系统调用交给模拟器处理，不需要先启动 Linux 内核。对于当前的实验，这样比较轻便；如果以后要研究内核驱动、中断或操作系统调度，就需要另外搭 full-system 环境。本篇也没有配置 CPU cache，先让 CPU 端口直接连接总线和内存控制器。</w:t>
       </w:r>
     </w:p>
     <w:p>
       <w:pPr>
-        <w:pStyle w:val="Heading2"/>
+        <w:pStyle w:val="Heading3"/>
       </w:pPr>
       <w:r>
         <w:rPr>
           <w:rFonts w:ascii="Arial Unicode MS" w:hAnsi="Arial Unicode MS" w:eastAsia="Arial Unicode MS" w:hint="eastAsia"/>
           <w:color w:val="000000"/>
-          <w:sz w:val="26"/>
+          <w:sz w:val="23"/>
           <w:lang w:val="en-US" w:eastAsia="zh-CN"/>
         </w:rPr>
-        <w:t>三 为什么采用单进程嵌入</w:t>
+        <w:t>为什么把两边放在一个进程里</w:t>
       </w:r>
     </w:p>
     <w:p>
@@ -463,7 +498,7 @@
           <w:sz w:val="21"/>
           <w:lang w:val="en-US" w:eastAsia="zh-CN"/>
         </w:rPr>
-        <w:t>连接 gem5 和 SystemC 有多种方式。最直接的做法是让二者分别运行，再通过 socket 或共享内存通信。这样容易把程序启动起来，但时间协调会变得复杂：一边前进多少周期后应该等待另一边，消息到达时间如何转换，进程调度造成的延迟是否影响模拟结果，都需要额外协议。</w:t>
+        <w:t>gem5 和 SystemC 可以分别运行，通过 socket 或共享内存通信。不过这样还要约定：两边各自能往前跑多远，消息对应哪个模拟时刻，什么时候停下来等对方。</w:t>
       </w:r>
     </w:p>
     <w:p>
@@ -474,7 +509,7 @@
           <w:sz w:val="21"/>
           <w:lang w:val="en-US" w:eastAsia="zh-CN"/>
         </w:rPr>
-        <w:t xml:space="preserve">本系列采用 gem5 自带的 </w:t>
+        <w:t xml:space="preserve">这里采用 gem5 自带的 </w:t>
       </w:r>
       <w:r>
         <w:rPr>
@@ -492,36 +527,7 @@
           <w:sz w:val="21"/>
           <w:lang w:val="en-US" w:eastAsia="zh-CN"/>
         </w:rPr>
-        <w:t xml:space="preserve"> 方式：将 gem5 构建为 C++ 可配置的共享库 </w:t>
-      </w:r>
-      <w:r>
-        <w:rPr>
-          <w:rFonts w:ascii="Menlo" w:hAnsi="Menlo" w:eastAsia="Arial Unicode MS" w:hint="eastAsia"/>
-          <w:color w:val="204E79"/>
-          <w:sz w:val="20"/>
-          <w:lang w:val="en-US" w:eastAsia="zh-CN"/>
-        </w:rPr>
-        <w:t>libgem5</w:t>
-      </w:r>
-      <w:r>
-        <w:rPr>
-          <w:rFonts w:ascii="Arial Unicode MS" w:hAnsi="Arial Unicode MS" w:eastAsia="Arial Unicode MS" w:hint="eastAsia"/>
-          <w:color w:val="20242A"/>
-          <w:sz w:val="21"/>
-          <w:lang w:val="en-US" w:eastAsia="zh-CN"/>
-        </w:rPr>
-        <w:t>，由外部 SystemC kernel 承载 gem5 event queue。</w:t>
-      </w:r>
-    </w:p>
-    <w:p>
-      <w:r>
-        <w:rPr>
-          <w:rFonts w:ascii="Arial Unicode MS" w:hAnsi="Arial Unicode MS" w:eastAsia="Arial Unicode MS" w:hint="eastAsia"/>
-          <w:color w:val="20242A"/>
-          <w:sz w:val="21"/>
-          <w:lang w:val="en-US" w:eastAsia="zh-CN"/>
-        </w:rPr>
-        <w:t>这里有一个容易混淆的配置点。我们不是启用 gem5 内部自带的 SystemC kernel，而是：</w:t>
+        <w:t xml:space="preserve"> 示例所使用的方式，把 gem5 编译成共享库，由外部 SystemC kernel 承载它的事件队列。最终运行的是一个 Host 进程，里面同时有 gem5 对象和 SystemC 模块：</w:t>
       </w:r>
     </w:p>
     <w:p>
@@ -557,25 +563,7 @@
           <w:sz w:val="21"/>
           <w:lang w:val="en-US" w:eastAsia="zh-CN"/>
         </w:rPr>
-        <w:t xml:space="preserve">因此，在这一方案中构建 </w:t>
-      </w:r>
-      <w:r>
-        <w:rPr>
-          <w:rFonts w:ascii="Menlo" w:hAnsi="Menlo" w:eastAsia="Arial Unicode MS" w:hint="eastAsia"/>
-          <w:color w:val="204E79"/>
-          <w:sz w:val="20"/>
-          <w:lang w:val="en-US" w:eastAsia="zh-CN"/>
-        </w:rPr>
-        <w:t>libgem5</w:t>
-      </w:r>
-      <w:r>
-        <w:rPr>
-          <w:rFonts w:ascii="Arial Unicode MS" w:hAnsi="Arial Unicode MS" w:eastAsia="Arial Unicode MS" w:hint="eastAsia"/>
-          <w:color w:val="20242A"/>
-          <w:sz w:val="21"/>
-          <w:lang w:val="en-US" w:eastAsia="zh-CN"/>
-        </w:rPr>
-        <w:t xml:space="preserve"> 时使用 </w:t>
+        <w:t xml:space="preserve">构建时有个看起来有些反直觉的选项：这里要用 </w:t>
       </w:r>
       <w:r>
         <w:rPr>
@@ -593,25 +581,7 @@
           <w:sz w:val="21"/>
           <w:lang w:val="en-US" w:eastAsia="zh-CN"/>
         </w:rPr>
-        <w:t xml:space="preserve"> 是合理的。SystemC 由 Host 工程单独链接，adapter 负责把 gem5 的事件队列映射到外部 SystemC 时间轴。</w:t>
-      </w:r>
-      <w:r>
-        <w:rPr>
-          <w:rFonts w:ascii="Menlo" w:hAnsi="Menlo" w:eastAsia="Arial Unicode MS" w:hint="eastAsia"/>
-          <w:color w:val="204E79"/>
-          <w:sz w:val="20"/>
-          <w:lang w:val="en-US" w:eastAsia="zh-CN"/>
-        </w:rPr>
-        <w:t>USE_SYSTEMC=y</w:t>
-      </w:r>
-      <w:r>
-        <w:rPr>
-          <w:rFonts w:ascii="Arial Unicode MS" w:hAnsi="Arial Unicode MS" w:eastAsia="Arial Unicode MS" w:hint="eastAsia"/>
-          <w:color w:val="20242A"/>
-          <w:sz w:val="21"/>
-          <w:lang w:val="en-US" w:eastAsia="zh-CN"/>
-        </w:rPr>
-        <w:t xml:space="preserve"> 对应另一种 gem5 构建方式，不能与本文方案混为一谈。</w:t>
+        <w:t>。它关闭的是 gem5 内部的 SystemC 实现；我们使用的 Accellera SystemC 库由 Host 单独链接，并没有把联合仿真所需的 SystemC 关掉。</w:t>
       </w:r>
     </w:p>
     <w:p>
@@ -622,7 +592,7 @@
           <w:sz w:val="21"/>
           <w:lang w:val="en-US" w:eastAsia="zh-CN"/>
         </w:rPr>
-        <w:t xml:space="preserve">单进程方式便于统一时间协调和退出管理，但不会自动统一两个框架的生命周期。本文使用的上游 adapter 只支持单个 gem5 主事件队列、协作式 SystemC 进程，并要求仿真中至多创建一个 </w:t>
+        <w:t xml:space="preserve">这份上游 adapter 支持单个 gem5 主事件队列，整个仿真里只创建一个 </w:t>
       </w:r>
       <w:r>
         <w:rPr>
@@ -640,7 +610,7 @@
           <w:sz w:val="21"/>
           <w:lang w:val="en-US" w:eastAsia="zh-CN"/>
         </w:rPr>
-        <w:t>。它不是并行运行多个 gem5 kernel 的通用接口。构建时，gem5、SystemC、编译器和 C++ ABI 也必须兼容。</w:t>
+        <w:t>。第一篇就按这个结构来，不涉及多个 gem5 实例或并行事件队列。</w:t>
       </w:r>
     </w:p>
     <w:p>
@@ -654,7 +624,7 @@
           <w:sz w:val="26"/>
           <w:lang w:val="en-US" w:eastAsia="zh-CN"/>
         </w:rPr>
-        <w:t>四 两套调度器如何共享一条时间轴</w:t>
+        <w:t>三 时间由谁往前推</w:t>
       </w:r>
     </w:p>
     <w:p>
@@ -665,91 +635,7 @@
           <w:sz w:val="21"/>
           <w:lang w:val="en-US" w:eastAsia="zh-CN"/>
         </w:rPr>
-        <w:t>SystemC 和 gem5 都有自己的事件调度机制：</w:t>
-      </w:r>
-    </w:p>
-    <w:p>
-      <w:pPr>
-        <w:pStyle w:val="ListBullet"/>
-        <w:spacing w:after="60"/>
-      </w:pPr>
-      <w:r>
-        <w:rPr>
-          <w:rFonts w:ascii="Arial Unicode MS" w:hAnsi="Arial Unicode MS" w:eastAsia="Arial Unicode MS" w:hint="eastAsia"/>
-          <w:color w:val="20242A"/>
-          <w:sz w:val="21"/>
-          <w:lang w:val="en-US" w:eastAsia="zh-CN"/>
-        </w:rPr>
-        <w:t xml:space="preserve">SystemC 使用 </w:t>
-      </w:r>
-      <w:r>
-        <w:rPr>
-          <w:rFonts w:ascii="Menlo" w:hAnsi="Menlo" w:eastAsia="Arial Unicode MS" w:hint="eastAsia"/>
-          <w:color w:val="204E79"/>
-          <w:sz w:val="20"/>
-          <w:lang w:val="en-US" w:eastAsia="zh-CN"/>
-        </w:rPr>
-        <w:t>sc_event</w:t>
-      </w:r>
-      <w:r>
-        <w:rPr>
-          <w:rFonts w:ascii="Arial Unicode MS" w:hAnsi="Arial Unicode MS" w:eastAsia="Arial Unicode MS" w:hint="eastAsia"/>
-          <w:color w:val="20242A"/>
-          <w:sz w:val="21"/>
-          <w:lang w:val="en-US" w:eastAsia="zh-CN"/>
-        </w:rPr>
-        <w:t>、</w:t>
-      </w:r>
-      <w:r>
-        <w:rPr>
-          <w:rFonts w:ascii="Menlo" w:hAnsi="Menlo" w:eastAsia="Arial Unicode MS" w:hint="eastAsia"/>
-          <w:color w:val="204E79"/>
-          <w:sz w:val="20"/>
-          <w:lang w:val="en-US" w:eastAsia="zh-CN"/>
-        </w:rPr>
-        <w:t>SC_THREAD</w:t>
-      </w:r>
-      <w:r>
-        <w:rPr>
-          <w:rFonts w:ascii="Arial Unicode MS" w:hAnsi="Arial Unicode MS" w:eastAsia="Arial Unicode MS" w:hint="eastAsia"/>
-          <w:color w:val="20242A"/>
-          <w:sz w:val="21"/>
-          <w:lang w:val="en-US" w:eastAsia="zh-CN"/>
-        </w:rPr>
-        <w:t>、</w:t>
-      </w:r>
-      <w:r>
-        <w:rPr>
-          <w:rFonts w:ascii="Menlo" w:hAnsi="Menlo" w:eastAsia="Arial Unicode MS" w:hint="eastAsia"/>
-          <w:color w:val="204E79"/>
-          <w:sz w:val="20"/>
-          <w:lang w:val="en-US" w:eastAsia="zh-CN"/>
-        </w:rPr>
-        <w:t>SC_METHOD</w:t>
-      </w:r>
-      <w:r>
-        <w:rPr>
-          <w:rFonts w:ascii="Arial Unicode MS" w:hAnsi="Arial Unicode MS" w:eastAsia="Arial Unicode MS" w:hint="eastAsia"/>
-          <w:color w:val="20242A"/>
-          <w:sz w:val="21"/>
-          <w:lang w:val="en-US" w:eastAsia="zh-CN"/>
-        </w:rPr>
-        <w:t xml:space="preserve"> 和离散事件内核。</w:t>
-      </w:r>
-    </w:p>
-    <w:p>
-      <w:pPr>
-        <w:pStyle w:val="ListBullet"/>
-        <w:spacing w:after="60"/>
-      </w:pPr>
-      <w:r>
-        <w:rPr>
-          <w:rFonts w:ascii="Arial Unicode MS" w:hAnsi="Arial Unicode MS" w:eastAsia="Arial Unicode MS" w:hint="eastAsia"/>
-          <w:color w:val="20242A"/>
-          <w:sz w:val="21"/>
-          <w:lang w:val="en-US" w:eastAsia="zh-CN"/>
-        </w:rPr>
-        <w:t>gem5 使用 EventQueue，并用 tick 表示模拟时间。</w:t>
+        <w:t>把库链接到一起之后，还有一个问题：gem5 和 SystemC 都有自己的事件调度器，究竟听谁的？</w:t>
       </w:r>
     </w:p>
     <w:p>
@@ -760,17 +646,10 @@
           <w:sz w:val="21"/>
           <w:lang w:val="en-US" w:eastAsia="zh-CN"/>
         </w:rPr>
-        <w:t xml:space="preserve">联合仿真不能让两个调度器各走各的。本文让 SystemC 成为外层时间轴，gem5 adapter 每次查看 gem5 的下一事件：如果事件就在当前时刻，则立即处理；如果事件发生在未来，则安排一个延迟的 </w:t>
+        <w:t>这里由 SystemC 控制外层时间。adapter 查看 gem5 队列中最早的事件，如果已经到了执行时刻，就处理它；如果还没到，就向 SystemC 安排一次定时通知，把控制权交回去。</w:t>
       </w:r>
-      <w:r>
-        <w:rPr>
-          <w:rFonts w:ascii="Menlo" w:hAnsi="Menlo" w:eastAsia="Arial Unicode MS" w:hint="eastAsia"/>
-          <w:color w:val="204E79"/>
-          <w:sz w:val="20"/>
-          <w:lang w:val="en-US" w:eastAsia="zh-CN"/>
-        </w:rPr>
-        <w:t>sc_event</w:t>
-      </w:r>
+    </w:p>
+    <w:p>
       <w:r>
         <w:rPr>
           <w:rFonts w:ascii="Arial Unicode MS" w:hAnsi="Arial Unicode MS" w:eastAsia="Arial Unicode MS" w:hint="eastAsia"/>
@@ -778,7 +657,7 @@
           <w:sz w:val="21"/>
           <w:lang w:val="en-US" w:eastAsia="zh-CN"/>
         </w:rPr>
-        <w:t>，等 SystemC 时间到达后再处理。</w:t>
+        <w:t>举个例子：SystemC 当前是 10 ns，gem5 下一事件在 12 ns。adapter 会安排一个 2 ns 后的通知。期间如果 SystemC 模块在 11 ns 有事要做，内核仍会先处理它，不会因为 gem5 在等 12 ns 就跳过它。</w:t>
       </w:r>
     </w:p>
     <w:p>
@@ -845,7 +724,7 @@
           <w:sz w:val="21"/>
           <w:lang w:val="en-US" w:eastAsia="zh-CN"/>
         </w:rPr>
-        <w:t xml:space="preserve">上游的 </w:t>
+        <w:t xml:space="preserve">上游 </w:t>
       </w:r>
       <w:r>
         <w:rPr>
@@ -863,79 +742,7 @@
           <w:sz w:val="21"/>
           <w:lang w:val="en-US" w:eastAsia="zh-CN"/>
         </w:rPr>
-        <w:t xml:space="preserve"> 是 </w:t>
-      </w:r>
-      <w:r>
-        <w:rPr>
-          <w:rFonts w:ascii="Menlo" w:hAnsi="Menlo" w:eastAsia="Arial Unicode MS" w:hint="eastAsia"/>
-          <w:color w:val="204E79"/>
-          <w:sz w:val="20"/>
-          <w:lang w:val="en-US" w:eastAsia="zh-CN"/>
-        </w:rPr>
-        <w:t>SC_METHOD</w:t>
-      </w:r>
-      <w:r>
-        <w:rPr>
-          <w:rFonts w:ascii="Arial Unicode MS" w:hAnsi="Arial Unicode MS" w:eastAsia="Arial Unicode MS" w:hint="eastAsia"/>
-          <w:color w:val="20242A"/>
-          <w:sz w:val="21"/>
-          <w:lang w:val="en-US" w:eastAsia="zh-CN"/>
-        </w:rPr>
-        <w:t xml:space="preserve">，不能在其中调用 </w:t>
-      </w:r>
-      <w:r>
-        <w:rPr>
-          <w:rFonts w:ascii="Menlo" w:hAnsi="Menlo" w:eastAsia="Arial Unicode MS" w:hint="eastAsia"/>
-          <w:color w:val="204E79"/>
-          <w:sz w:val="20"/>
-          <w:lang w:val="en-US" w:eastAsia="zh-CN"/>
-        </w:rPr>
-        <w:t>wait()</w:t>
-      </w:r>
-      <w:r>
-        <w:rPr>
-          <w:rFonts w:ascii="Arial Unicode MS" w:hAnsi="Arial Unicode MS" w:eastAsia="Arial Unicode MS" w:hint="eastAsia"/>
-          <w:color w:val="20242A"/>
-          <w:sz w:val="21"/>
-          <w:lang w:val="en-US" w:eastAsia="zh-CN"/>
-        </w:rPr>
-        <w:t>。它安排定时事件后返回，把控制权交还给 SystemC kernel；</w:t>
-      </w:r>
-      <w:r>
-        <w:rPr>
-          <w:rFonts w:ascii="Menlo" w:hAnsi="Menlo" w:eastAsia="Arial Unicode MS" w:hint="eastAsia"/>
-          <w:color w:val="204E79"/>
-          <w:sz w:val="20"/>
-          <w:lang w:val="en-US" w:eastAsia="zh-CN"/>
-        </w:rPr>
-        <w:t>simulate()</w:t>
-      </w:r>
-      <w:r>
-        <w:rPr>
-          <w:rFonts w:ascii="Arial Unicode MS" w:hAnsi="Arial Unicode MS" w:eastAsia="Arial Unicode MS" w:hint="eastAsia"/>
-          <w:color w:val="20242A"/>
-          <w:sz w:val="21"/>
-          <w:lang w:val="en-US" w:eastAsia="zh-CN"/>
-        </w:rPr>
-        <w:t xml:space="preserve"> 则由 Host 的 </w:t>
-      </w:r>
-      <w:r>
-        <w:rPr>
-          <w:rFonts w:ascii="Menlo" w:hAnsi="Menlo" w:eastAsia="Arial Unicode MS" w:hint="eastAsia"/>
-          <w:color w:val="204E79"/>
-          <w:sz w:val="20"/>
-          <w:lang w:val="en-US" w:eastAsia="zh-CN"/>
-        </w:rPr>
-        <w:t>SC_THREAD</w:t>
-      </w:r>
-      <w:r>
-        <w:rPr>
-          <w:rFonts w:ascii="Arial Unicode MS" w:hAnsi="Arial Unicode MS" w:eastAsia="Arial Unicode MS" w:hint="eastAsia"/>
-          <w:color w:val="20242A"/>
-          <w:sz w:val="21"/>
-          <w:lang w:val="en-US" w:eastAsia="zh-CN"/>
-        </w:rPr>
-        <w:t xml:space="preserve"> 调用，等待退出通知。下面是事件处理方法的示意伪代码，不是可直接编译的替代实现：</w:t>
+        <w:t xml:space="preserve"> 的主要逻辑可以缩写成下面这样。这里只保留时间判断和退出处理，完整实现见文末源码链接。</w:t>
       </w:r>
     </w:p>
     <w:p>
@@ -993,7 +800,126 @@
           <w:sz w:val="21"/>
           <w:lang w:val="en-US" w:eastAsia="zh-CN"/>
         </w:rPr>
-        <w:t xml:space="preserve">上游还使用 </w:t>
+        <w:t xml:space="preserve">注意这里的 </w:t>
+      </w:r>
+      <w:r>
+        <w:rPr>
+          <w:rFonts w:ascii="Menlo" w:hAnsi="Menlo" w:eastAsia="Arial Unicode MS" w:hint="eastAsia"/>
+          <w:color w:val="204E79"/>
+          <w:sz w:val="20"/>
+          <w:lang w:val="en-US" w:eastAsia="zh-CN"/>
+        </w:rPr>
+        <w:t>return</w:t>
+      </w:r>
+      <w:r>
+        <w:rPr>
+          <w:rFonts w:ascii="Arial Unicode MS" w:hAnsi="Arial Unicode MS" w:eastAsia="Arial Unicode MS" w:hint="eastAsia"/>
+          <w:color w:val="20242A"/>
+          <w:sz w:val="21"/>
+          <w:lang w:val="en-US" w:eastAsia="zh-CN"/>
+        </w:rPr>
+        <w:t>。</w:t>
+      </w:r>
+      <w:r>
+        <w:rPr>
+          <w:rFonts w:ascii="Menlo" w:hAnsi="Menlo" w:eastAsia="Arial Unicode MS" w:hint="eastAsia"/>
+          <w:color w:val="204E79"/>
+          <w:sz w:val="20"/>
+          <w:lang w:val="en-US" w:eastAsia="zh-CN"/>
+        </w:rPr>
+        <w:t>eventLoop()</w:t>
+      </w:r>
+      <w:r>
+        <w:rPr>
+          <w:rFonts w:ascii="Arial Unicode MS" w:hAnsi="Arial Unicode MS" w:eastAsia="Arial Unicode MS" w:hint="eastAsia"/>
+          <w:color w:val="20242A"/>
+          <w:sz w:val="21"/>
+          <w:lang w:val="en-US" w:eastAsia="zh-CN"/>
+        </w:rPr>
+        <w:t xml:space="preserve"> 是一个 </w:t>
+      </w:r>
+      <w:r>
+        <w:rPr>
+          <w:rFonts w:ascii="Menlo" w:hAnsi="Menlo" w:eastAsia="Arial Unicode MS" w:hint="eastAsia"/>
+          <w:color w:val="204E79"/>
+          <w:sz w:val="20"/>
+          <w:lang w:val="en-US" w:eastAsia="zh-CN"/>
+        </w:rPr>
+        <w:t>SC_METHOD</w:t>
+      </w:r>
+      <w:r>
+        <w:rPr>
+          <w:rFonts w:ascii="Arial Unicode MS" w:hAnsi="Arial Unicode MS" w:eastAsia="Arial Unicode MS" w:hint="eastAsia"/>
+          <w:color w:val="20242A"/>
+          <w:sz w:val="21"/>
+          <w:lang w:val="en-US" w:eastAsia="zh-CN"/>
+        </w:rPr>
+        <w:t xml:space="preserve">，不能在里面调用 </w:t>
+      </w:r>
+      <w:r>
+        <w:rPr>
+          <w:rFonts w:ascii="Menlo" w:hAnsi="Menlo" w:eastAsia="Arial Unicode MS" w:hint="eastAsia"/>
+          <w:color w:val="204E79"/>
+          <w:sz w:val="20"/>
+          <w:lang w:val="en-US" w:eastAsia="zh-CN"/>
+        </w:rPr>
+        <w:t>wait()</w:t>
+      </w:r>
+      <w:r>
+        <w:rPr>
+          <w:rFonts w:ascii="Arial Unicode MS" w:hAnsi="Arial Unicode MS" w:eastAsia="Arial Unicode MS" w:hint="eastAsia"/>
+          <w:color w:val="20242A"/>
+          <w:sz w:val="21"/>
+          <w:lang w:val="en-US" w:eastAsia="zh-CN"/>
+        </w:rPr>
+        <w:t xml:space="preserve">，而是先安排通知，再返回。等通知到来，SystemC 会重新调用它。Host 中调用 </w:t>
+      </w:r>
+      <w:r>
+        <w:rPr>
+          <w:rFonts w:ascii="Menlo" w:hAnsi="Menlo" w:eastAsia="Arial Unicode MS" w:hint="eastAsia"/>
+          <w:color w:val="204E79"/>
+          <w:sz w:val="20"/>
+          <w:lang w:val="en-US" w:eastAsia="zh-CN"/>
+        </w:rPr>
+        <w:t>simulate()</w:t>
+      </w:r>
+      <w:r>
+        <w:rPr>
+          <w:rFonts w:ascii="Arial Unicode MS" w:hAnsi="Arial Unicode MS" w:eastAsia="Arial Unicode MS" w:hint="eastAsia"/>
+          <w:color w:val="20242A"/>
+          <w:sz w:val="21"/>
+          <w:lang w:val="en-US" w:eastAsia="zh-CN"/>
+        </w:rPr>
+        <w:t xml:space="preserve"> 的则是 </w:t>
+      </w:r>
+      <w:r>
+        <w:rPr>
+          <w:rFonts w:ascii="Menlo" w:hAnsi="Menlo" w:eastAsia="Arial Unicode MS" w:hint="eastAsia"/>
+          <w:color w:val="204E79"/>
+          <w:sz w:val="20"/>
+          <w:lang w:val="en-US" w:eastAsia="zh-CN"/>
+        </w:rPr>
+        <w:t>SC_THREAD</w:t>
+      </w:r>
+      <w:r>
+        <w:rPr>
+          <w:rFonts w:ascii="Arial Unicode MS" w:hAnsi="Arial Unicode MS" w:eastAsia="Arial Unicode MS" w:hint="eastAsia"/>
+          <w:color w:val="20242A"/>
+          <w:sz w:val="21"/>
+          <w:lang w:val="en-US" w:eastAsia="zh-CN"/>
+        </w:rPr>
+        <w:t>，这个线程可以等待仿真退出通知。</w:t>
+      </w:r>
+    </w:p>
+    <w:p>
+      <w:r>
+        <w:rPr>
+          <w:rFonts w:ascii="Arial Unicode MS" w:hAnsi="Arial Unicode MS" w:eastAsia="Arial Unicode MS" w:hint="eastAsia"/>
+          <w:color w:val="20242A"/>
+          <w:sz w:val="21"/>
+          <w:lang w:val="en-US" w:eastAsia="zh-CN"/>
+        </w:rPr>
+        <w:t xml:space="preserve">还有一种情况：原本打算等到 12 ns，但 SystemC 模块在 11 ns 向 gem5 插入了一个更早的事件。这时必须通过 adapter 的外部通知机制提前唤醒事件处理，重新检查队列。上游用 </w:t>
       </w:r>
       <w:r>
         <w:rPr>
@@ -1011,7 +937,7 @@
           <w:sz w:val="21"/>
           <w:lang w:val="en-US" w:eastAsia="zh-CN"/>
         </w:rPr>
-        <w:t xml:space="preserve"> 处理提前唤醒：SystemC 一侧插入更早的 gem5 事件后，必须通知 adapter 重新检查队列，不能继续等原来的截止时间。同一时间戳内还涉及 gem5 事件优先级和 SystemC delta cycle，不能把它简化为任意排列的同时执行。</w:t>
+        <w:t xml:space="preserve"> 处理这件事，后面写 Bridge 时还会用到。</w:t>
       </w:r>
     </w:p>
     <w:p>
@@ -1022,7 +948,25 @@
           <w:sz w:val="21"/>
           <w:lang w:val="en-US" w:eastAsia="zh-CN"/>
         </w:rPr>
-        <w:t xml:space="preserve">共享时间轴也不意味着任意时刻的 </w:t>
+        <w:t xml:space="preserve">代码里的 </w:t>
+      </w:r>
+      <w:r>
+        <w:rPr>
+          <w:rFonts w:ascii="Menlo" w:hAnsi="Menlo" w:eastAsia="Arial Unicode MS" w:hint="eastAsia"/>
+          <w:color w:val="204E79"/>
+          <w:sz w:val="20"/>
+          <w:lang w:val="en-US" w:eastAsia="zh-CN"/>
+        </w:rPr>
+        <w:t>catchup()</w:t>
+      </w:r>
+      <w:r>
+        <w:rPr>
+          <w:rFonts w:ascii="Arial Unicode MS" w:hAnsi="Arial Unicode MS" w:eastAsia="Arial Unicode MS" w:hint="eastAsia"/>
+          <w:color w:val="20242A"/>
+          <w:sz w:val="21"/>
+          <w:lang w:val="en-US" w:eastAsia="zh-CN"/>
+        </w:rPr>
+        <w:t xml:space="preserve"> 也值得留意。在两个 gem5 事件之间，SystemC 可能已经往前走了，</w:t>
       </w:r>
       <w:r>
         <w:rPr>
@@ -1040,25 +984,7 @@
           <w:sz w:val="21"/>
           <w:lang w:val="en-US" w:eastAsia="zh-CN"/>
         </w:rPr>
-        <w:t xml:space="preserve"> 都与 </w:t>
-      </w:r>
-      <w:r>
-        <w:rPr>
-          <w:rFonts w:ascii="Menlo" w:hAnsi="Menlo" w:eastAsia="Arial Unicode MS" w:hint="eastAsia"/>
-          <w:color w:val="204E79"/>
-          <w:sz w:val="20"/>
-          <w:lang w:val="en-US" w:eastAsia="zh-CN"/>
-        </w:rPr>
-        <w:t>sc_time_stamp()</w:t>
-      </w:r>
-      <w:r>
-        <w:rPr>
-          <w:rFonts w:ascii="Arial Unicode MS" w:hAnsi="Arial Unicode MS" w:eastAsia="Arial Unicode MS" w:hint="eastAsia"/>
-          <w:color w:val="20242A"/>
-          <w:sz w:val="21"/>
-          <w:lang w:val="en-US" w:eastAsia="zh-CN"/>
-        </w:rPr>
-        <w:t xml:space="preserve"> 相等。当 SystemC 在两个 gem5 事件之间运行时，gem5 的当前 tick 可以暂时落后；adapter 在处理事件时通过 </w:t>
+        <w:t xml:space="preserve"> 还停留在上次处理事件的时刻。</w:t>
       </w:r>
       <w:r>
         <w:rPr>
@@ -1076,7 +1002,21 @@
           <w:sz w:val="21"/>
           <w:lang w:val="en-US" w:eastAsia="zh-CN"/>
         </w:rPr>
-        <w:t xml:space="preserve"> 对齐。后续 Bridge 从 SystemC 调回 gem5、安排新事件前，也需要遵循这一时间对齐与通知约定。</w:t>
+        <w:t xml:space="preserve"> 把它对齐到当前 SystemC 时间。所以“共用一条时间轴”并不意味着随时读取两个时间戳，它们都恰好相等。以后从 SystemC 回调 gem5 时，也要先处理好这个对齐关系。</w:t>
+      </w:r>
+    </w:p>
+    <w:p>
+      <w:pPr>
+        <w:pStyle w:val="Heading3"/>
+      </w:pPr>
+      <w:r>
+        <w:rPr>
+          <w:rFonts w:ascii="Arial Unicode MS" w:hAnsi="Arial Unicode MS" w:eastAsia="Arial Unicode MS" w:hint="eastAsia"/>
+          <w:color w:val="000000"/>
+          <w:sz w:val="23"/>
+          <w:lang w:val="en-US" w:eastAsia="zh-CN"/>
+        </w:rPr>
+        <w:t>统一时间单位</w:t>
       </w:r>
     </w:p>
     <w:p>
@@ -1087,7 +1027,7 @@
           <w:sz w:val="21"/>
           <w:lang w:val="en-US" w:eastAsia="zh-CN"/>
         </w:rPr>
-        <w:t xml:space="preserve">为了简化换算，本系列把 gem5 tick frequency 设置为 </w:t>
+        <w:t xml:space="preserve">这份 adapter 假定一个 gem5 tick 就是 1 ps，因此 Host 将 gem5 频率设为 </w:t>
       </w:r>
       <w:r>
         <w:rPr>
@@ -1105,7 +1045,7 @@
           <w:sz w:val="21"/>
           <w:lang w:val="en-US" w:eastAsia="zh-CN"/>
         </w:rPr>
-        <w:t xml:space="preserve">，并将 SystemC 时间分辨率设为 </w:t>
+        <w:t xml:space="preserve">，SystemC 分辨率设为 </w:t>
       </w:r>
       <w:r>
         <w:rPr>
@@ -1123,7 +1063,7 @@
           <w:sz w:val="21"/>
           <w:lang w:val="en-US" w:eastAsia="zh-CN"/>
         </w:rPr>
-        <w:t>。这样：</w:t>
+        <w:t>：</w:t>
       </w:r>
     </w:p>
     <w:p>
@@ -1151,7 +1091,7 @@
           <w:sz w:val="21"/>
           <w:lang w:val="en-US" w:eastAsia="zh-CN"/>
         </w:rPr>
-        <w:t>这不是说 CPU 或 NPU 的周期都是 1 ps。CPU 可以使用 1.6 GHz，NPU 可以使用 800 MHz；1 ps 只是公共时间刻度。实际时钟周期仍由各自 clock domain 决定。</w:t>
+        <w:t>这只是时间刻度，不是 CPU 或 NPU 的时钟周期。例子里的 CPU 是 1.6 GHz，对应 625 ps；SystemC 侧时钟是 800 MHz，对应 1250 ps。两个时钟都能用整数个 tick 表示，换算比较直接。</w:t>
       </w:r>
     </w:p>
     <w:p>
@@ -1162,25 +1102,7 @@
           <w:sz w:val="21"/>
           <w:lang w:val="en-US" w:eastAsia="zh-CN"/>
         </w:rPr>
-        <w:t xml:space="preserve">如果 SystemC 分辨率不是 1 ps，直接把 </w:t>
-      </w:r>
-      <w:r>
-        <w:rPr>
-          <w:rFonts w:ascii="Menlo" w:hAnsi="Menlo" w:eastAsia="Arial Unicode MS" w:hint="eastAsia"/>
-          <w:color w:val="204E79"/>
-          <w:sz w:val="20"/>
-          <w:lang w:val="en-US" w:eastAsia="zh-CN"/>
-        </w:rPr>
-        <w:t>sc_time_stamp().value()</w:t>
-      </w:r>
-      <w:r>
-        <w:rPr>
-          <w:rFonts w:ascii="Arial Unicode MS" w:hAnsi="Arial Unicode MS" w:eastAsia="Arial Unicode MS" w:hint="eastAsia"/>
-          <w:color w:val="20242A"/>
-          <w:sz w:val="21"/>
-          <w:lang w:val="en-US" w:eastAsia="zh-CN"/>
-        </w:rPr>
-        <w:t xml:space="preserve"> 当作 gem5 tick 就会产生错误。因此示例 Host 在启动阶段显式检查时间分辨率，发现不一致就立即终止。</w:t>
+        <w:t>Host 在启动时会检查 SystemC 分辨率。如果它不是 1 ps，就停止运行，避免带着错误的时间单位继续仿真。同一个时间戳内部仍有 gem5 事件优先级和 SystemC delta cycle 的先后关系，这部分留到接入双向请求时再展开。</w:t>
       </w:r>
     </w:p>
     <w:p>
@@ -1194,7 +1116,7 @@
           <w:sz w:val="26"/>
           <w:lang w:val="en-US" w:eastAsia="zh-CN"/>
         </w:rPr>
-        <w:t>五 从 sc_main 到 Guest 退出</w:t>
+        <w:t>四 程序怎么启动和退出</w:t>
       </w:r>
     </w:p>
     <w:p>
@@ -1205,7 +1127,7 @@
           <w:sz w:val="21"/>
           <w:lang w:val="en-US" w:eastAsia="zh-CN"/>
         </w:rPr>
-        <w:t>联合仿真的生命周期比普通 SystemC 程序长一些。</w:t>
+        <w:t>接下来看代码入口。把下面这条调用顺序理清，后面遇到“对象没初始化”或“端口没接上”时，会比较容易定位。</w:t>
       </w:r>
     </w:p>
     <w:p>
@@ -1265,20 +1187,15 @@
       </w:r>
     </w:p>
     <w:p>
-      <w:pPr>
-        <w:pStyle w:val="Heading3"/>
-      </w:pPr>
       <w:r>
         <w:rPr>
           <w:rFonts w:ascii="Arial Unicode MS" w:hAnsi="Arial Unicode MS" w:eastAsia="Arial Unicode MS" w:hint="eastAsia"/>
-          <w:color w:val="000000"/>
-          <w:sz w:val="23"/>
+          <w:color w:val="20242A"/>
+          <w:sz w:val="21"/>
           <w:lang w:val="en-US" w:eastAsia="zh-CN"/>
         </w:rPr>
-        <w:t>1 创建 Host 对象</w:t>
+        <w:t xml:space="preserve">在 </w:t>
       </w:r>
-    </w:p>
-    <w:p>
       <w:r>
         <w:rPr>
           <w:rFonts w:ascii="Menlo" w:hAnsi="Menlo" w:eastAsia="Arial Unicode MS" w:hint="eastAsia"/>
@@ -1295,7 +1212,7 @@
           <w:sz w:val="21"/>
           <w:lang w:val="en-US" w:eastAsia="zh-CN"/>
         </w:rPr>
-        <w:t xml:space="preserve"> 首先设置 1 ps 时间分辨率，然后创建 SystemC Top、观察时钟和 </w:t>
+        <w:t xml:space="preserve"> 里，先设置时间分辨率，再创建时钟、计数模块和 </w:t>
       </w:r>
       <w:r>
         <w:rPr>
@@ -1315,8 +1232,6 @@
         </w:rPr>
         <w:t>。</w:t>
       </w:r>
-    </w:p>
-    <w:p>
       <w:r>
         <w:rPr>
           <w:rFonts w:ascii="Menlo" w:hAnsi="Menlo" w:eastAsia="Arial Unicode MS" w:hint="eastAsia"/>
@@ -1333,7 +1248,7 @@
           <w:sz w:val="21"/>
           <w:lang w:val="en-US" w:eastAsia="zh-CN"/>
         </w:rPr>
-        <w:t xml:space="preserve"> 继承 </w:t>
+        <w:t xml:space="preserve"> 继承上游的 </w:t>
       </w:r>
       <w:r>
         <w:rPr>
@@ -1351,7 +1266,7 @@
           <w:sz w:val="21"/>
           <w:lang w:val="en-US" w:eastAsia="zh-CN"/>
         </w:rPr>
-        <w:t xml:space="preserve">。构造阶段完成 gem5 日志、统计、事件队列和 C++ 配置管理器的初始化，并读取由 gem5 Python 配置脚本生成的 </w:t>
+        <w:t xml:space="preserve">，构造时初始化日志、统计和事件队列，并读取 </w:t>
       </w:r>
       <w:r>
         <w:rPr>
@@ -1373,20 +1288,6 @@
       </w:r>
     </w:p>
     <w:p>
-      <w:pPr>
-        <w:pStyle w:val="Heading3"/>
-      </w:pPr>
-      <w:r>
-        <w:rPr>
-          <w:rFonts w:ascii="Arial Unicode MS" w:hAnsi="Arial Unicode MS" w:eastAsia="Arial Unicode MS" w:hint="eastAsia"/>
-          <w:color w:val="000000"/>
-          <w:sz w:val="23"/>
-          <w:lang w:val="en-US" w:eastAsia="zh-CN"/>
-        </w:rPr>
-        <w:t>2 实例化 gem5 SimObject</w:t>
-      </w:r>
-    </w:p>
-    <w:p>
       <w:r>
         <w:rPr>
           <w:rFonts w:ascii="Arial Unicode MS" w:hAnsi="Arial Unicode MS" w:eastAsia="Arial Unicode MS" w:hint="eastAsia"/>
@@ -1394,7 +1295,7 @@
           <w:sz w:val="21"/>
           <w:lang w:val="en-US" w:eastAsia="zh-CN"/>
         </w:rPr>
-        <w:t xml:space="preserve">示例先用 </w:t>
+        <w:t xml:space="preserve">这个配置文件决定要创建哪些 gem5 对象，以及它们之间怎么连接。示例先调用 </w:t>
       </w:r>
       <w:r>
         <w:rPr>
@@ -1412,7 +1313,7 @@
           <w:sz w:val="21"/>
           <w:lang w:val="en-US" w:eastAsia="zh-CN"/>
         </w:rPr>
-        <w:t xml:space="preserve"> 创建模型对象，再逐个调用 </w:t>
+        <w:t xml:space="preserve">，再逐个 </w:t>
       </w:r>
       <w:r>
         <w:rPr>
@@ -1430,7 +1331,7 @@
           <w:sz w:val="21"/>
           <w:lang w:val="en-US" w:eastAsia="zh-CN"/>
         </w:rPr>
-        <w:t xml:space="preserve">，最后调用 </w:t>
+        <w:t xml:space="preserve">，最后执行 </w:t>
       </w:r>
       <w:r>
         <w:rPr>
@@ -1448,25 +1349,7 @@
           <w:sz w:val="21"/>
           <w:lang w:val="en-US" w:eastAsia="zh-CN"/>
         </w:rPr>
-        <w:t xml:space="preserve"> 完成 </w:t>
-      </w:r>
-      <w:r>
-        <w:rPr>
-          <w:rFonts w:ascii="Menlo" w:hAnsi="Menlo" w:eastAsia="Arial Unicode MS" w:hint="eastAsia"/>
-          <w:color w:val="204E79"/>
-          <w:sz w:val="20"/>
-          <w:lang w:val="en-US" w:eastAsia="zh-CN"/>
-        </w:rPr>
-        <w:t>init()</w:t>
-      </w:r>
-      <w:r>
-        <w:rPr>
-          <w:rFonts w:ascii="Arial Unicode MS" w:hAnsi="Arial Unicode MS" w:eastAsia="Arial Unicode MS" w:hint="eastAsia"/>
-          <w:color w:val="20242A"/>
-          <w:sz w:val="21"/>
-          <w:lang w:val="en-US" w:eastAsia="zh-CN"/>
-        </w:rPr>
-        <w:t>、统计和 probe 注册。</w:t>
+        <w:t xml:space="preserve">，完成对象初始化和统计注册。这里传 </w:t>
       </w:r>
       <w:r>
         <w:rPr>
@@ -1484,7 +1367,7 @@
           <w:sz w:val="21"/>
           <w:lang w:val="en-US" w:eastAsia="zh-CN"/>
         </w:rPr>
-        <w:t xml:space="preserve"> 表示对象和端口已经准备好。默认的 </w:t>
+        <w:t xml:space="preserve">，是因为对象创建和端口绑定已经做过了；默认的 </w:t>
       </w:r>
       <w:r>
         <w:rPr>
@@ -1502,39 +1385,7 @@
           <w:sz w:val="21"/>
           <w:lang w:val="en-US" w:eastAsia="zh-CN"/>
         </w:rPr>
-        <w:t xml:space="preserve"> 会自行完成对象创建与端口绑定；后续若手动连接外部端口，则必须在 SimObject 的 </w:t>
-      </w:r>
-      <w:r>
-        <w:rPr>
-          <w:rFonts w:ascii="Menlo" w:hAnsi="Menlo" w:eastAsia="Arial Unicode MS" w:hint="eastAsia"/>
-          <w:color w:val="204E79"/>
-          <w:sz w:val="20"/>
-          <w:lang w:val="en-US" w:eastAsia="zh-CN"/>
-        </w:rPr>
-        <w:t>init()</w:t>
-      </w:r>
-      <w:r>
-        <w:rPr>
-          <w:rFonts w:ascii="Arial Unicode MS" w:hAnsi="Arial Unicode MS" w:eastAsia="Arial Unicode MS" w:hint="eastAsia"/>
-          <w:color w:val="20242A"/>
-          <w:sz w:val="21"/>
-          <w:lang w:val="en-US" w:eastAsia="zh-CN"/>
-        </w:rPr>
-        <w:t xml:space="preserve"> 前完成，避免未连接错误或重复绑定。</w:t>
-      </w:r>
-    </w:p>
-    <w:p>
-      <w:pPr>
-        <w:pStyle w:val="Heading3"/>
-      </w:pPr>
-      <w:r>
-        <w:rPr>
-          <w:rFonts w:ascii="Arial Unicode MS" w:hAnsi="Arial Unicode MS" w:eastAsia="Arial Unicode MS" w:hint="eastAsia"/>
-          <w:color w:val="000000"/>
-          <w:sz w:val="23"/>
-          <w:lang w:val="en-US" w:eastAsia="zh-CN"/>
-        </w:rPr>
-        <w:t>3 装载 Guest ELF</w:t>
+        <w:t xml:space="preserve"> 会把这两步也一起完成。</w:t>
       </w:r>
     </w:p>
     <w:p>
@@ -1545,7 +1396,61 @@
           <w:sz w:val="21"/>
           <w:lang w:val="en-US" w:eastAsia="zh-CN"/>
         </w:rPr>
-        <w:t xml:space="preserve">SystemC elaboration 结束后，Host 调用 </w:t>
+        <w:t>随后，</w:t>
+      </w:r>
+      <w:r>
+        <w:rPr>
+          <w:rFonts w:ascii="Menlo" w:hAnsi="Menlo" w:eastAsia="Arial Unicode MS" w:hint="eastAsia"/>
+          <w:color w:val="204E79"/>
+          <w:sz w:val="20"/>
+          <w:lang w:val="en-US" w:eastAsia="zh-CN"/>
+        </w:rPr>
+        <w:t>sc_main</w:t>
+      </w:r>
+      <w:r>
+        <w:rPr>
+          <w:rFonts w:ascii="Arial Unicode MS" w:hAnsi="Arial Unicode MS" w:eastAsia="Arial Unicode MS" w:hint="eastAsia"/>
+          <w:color w:val="20242A"/>
+          <w:sz w:val="21"/>
+          <w:lang w:val="en-US" w:eastAsia="zh-CN"/>
+        </w:rPr>
+        <w:t xml:space="preserve"> 调用 </w:t>
+      </w:r>
+      <w:r>
+        <w:rPr>
+          <w:rFonts w:ascii="Menlo" w:hAnsi="Menlo" w:eastAsia="Arial Unicode MS" w:hint="eastAsia"/>
+          <w:color w:val="204E79"/>
+          <w:sz w:val="20"/>
+          <w:lang w:val="en-US" w:eastAsia="zh-CN"/>
+        </w:rPr>
+        <w:t>sc_start()</w:t>
+      </w:r>
+      <w:r>
+        <w:rPr>
+          <w:rFonts w:ascii="Arial Unicode MS" w:hAnsi="Arial Unicode MS" w:eastAsia="Arial Unicode MS" w:hint="eastAsia"/>
+          <w:color w:val="20242A"/>
+          <w:sz w:val="21"/>
+          <w:lang w:val="en-US" w:eastAsia="zh-CN"/>
+        </w:rPr>
+        <w:t xml:space="preserve">。SystemC 先执行 elaboration 相关回调，我们在 </w:t>
+      </w:r>
+      <w:r>
+        <w:rPr>
+          <w:rFonts w:ascii="Menlo" w:hAnsi="Menlo" w:eastAsia="Arial Unicode MS" w:hint="eastAsia"/>
+          <w:color w:val="204E79"/>
+          <w:sz w:val="20"/>
+          <w:lang w:val="en-US" w:eastAsia="zh-CN"/>
+        </w:rPr>
+        <w:t>end_of_elaboration()</w:t>
+      </w:r>
+      <w:r>
+        <w:rPr>
+          <w:rFonts w:ascii="Arial Unicode MS" w:hAnsi="Arial Unicode MS" w:eastAsia="Arial Unicode MS" w:hint="eastAsia"/>
+          <w:color w:val="20242A"/>
+          <w:sz w:val="21"/>
+          <w:lang w:val="en-US" w:eastAsia="zh-CN"/>
+        </w:rPr>
+        <w:t xml:space="preserve"> 中调用 gem5 的 </w:t>
       </w:r>
       <w:r>
         <w:rPr>
@@ -1581,86 +1486,7 @@
           <w:sz w:val="21"/>
           <w:lang w:val="en-US" w:eastAsia="zh-CN"/>
         </w:rPr>
-        <w:t>。gem5 的 SE workload 在这一步装载 ELF、建立地址映射、初始化栈和 PC。</w:t>
-      </w:r>
-    </w:p>
-    <w:p>
-      <w:pPr>
-        <w:pStyle w:val="Heading3"/>
-      </w:pPr>
-      <w:r>
-        <w:rPr>
-          <w:rFonts w:ascii="Arial Unicode MS" w:hAnsi="Arial Unicode MS" w:eastAsia="Arial Unicode MS" w:hint="eastAsia"/>
-          <w:color w:val="000000"/>
-          <w:sz w:val="23"/>
-          <w:lang w:val="en-US" w:eastAsia="zh-CN"/>
-        </w:rPr>
-        <w:t>4 推进两个事件系统</w:t>
-      </w:r>
-    </w:p>
-    <w:p>
-      <w:r>
-        <w:rPr>
-          <w:rFonts w:ascii="Arial Unicode MS" w:hAnsi="Arial Unicode MS" w:eastAsia="Arial Unicode MS" w:hint="eastAsia"/>
-          <w:color w:val="20242A"/>
-          <w:sz w:val="21"/>
-          <w:lang w:val="en-US" w:eastAsia="zh-CN"/>
-        </w:rPr>
-        <w:t xml:space="preserve">调用 </w:t>
-      </w:r>
-      <w:r>
-        <w:rPr>
-          <w:rFonts w:ascii="Menlo" w:hAnsi="Menlo" w:eastAsia="Arial Unicode MS" w:hint="eastAsia"/>
-          <w:color w:val="204E79"/>
-          <w:sz w:val="20"/>
-          <w:lang w:val="en-US" w:eastAsia="zh-CN"/>
-        </w:rPr>
-        <w:t>sc_start()</w:t>
-      </w:r>
-      <w:r>
-        <w:rPr>
-          <w:rFonts w:ascii="Arial Unicode MS" w:hAnsi="Arial Unicode MS" w:eastAsia="Arial Unicode MS" w:hint="eastAsia"/>
-          <w:color w:val="20242A"/>
-          <w:sz w:val="21"/>
-          <w:lang w:val="en-US" w:eastAsia="zh-CN"/>
-        </w:rPr>
-        <w:t xml:space="preserve"> 后，SystemC 先执行包括 </w:t>
-      </w:r>
-      <w:r>
-        <w:rPr>
-          <w:rFonts w:ascii="Menlo" w:hAnsi="Menlo" w:eastAsia="Arial Unicode MS" w:hint="eastAsia"/>
-          <w:color w:val="204E79"/>
-          <w:sz w:val="20"/>
-          <w:lang w:val="en-US" w:eastAsia="zh-CN"/>
-        </w:rPr>
-        <w:t>end_of_elaboration()</w:t>
-      </w:r>
-      <w:r>
-        <w:rPr>
-          <w:rFonts w:ascii="Arial Unicode MS" w:hAnsi="Arial Unicode MS" w:eastAsia="Arial Unicode MS" w:hint="eastAsia"/>
-          <w:color w:val="20242A"/>
-          <w:sz w:val="21"/>
-          <w:lang w:val="en-US" w:eastAsia="zh-CN"/>
-        </w:rPr>
-        <w:t xml:space="preserve"> 在内的启动回调，再进入进程调度。</w:t>
-      </w:r>
-      <w:r>
-        <w:rPr>
-          <w:rFonts w:ascii="Menlo" w:hAnsi="Menlo" w:eastAsia="Arial Unicode MS" w:hint="eastAsia"/>
-          <w:color w:val="204E79"/>
-          <w:sz w:val="20"/>
-          <w:lang w:val="en-US" w:eastAsia="zh-CN"/>
-        </w:rPr>
-        <w:t>Gem5Host</w:t>
-      </w:r>
-      <w:r>
-        <w:rPr>
-          <w:rFonts w:ascii="Arial Unicode MS" w:hAnsi="Arial Unicode MS" w:eastAsia="Arial Unicode MS" w:hint="eastAsia"/>
-          <w:color w:val="20242A"/>
-          <w:sz w:val="21"/>
-          <w:lang w:val="en-US" w:eastAsia="zh-CN"/>
-        </w:rPr>
-        <w:t xml:space="preserve"> 内部线程调用有 tick 上限的 </w:t>
+        <w:t xml:space="preserve">。SE 进程在这个阶段装载 ELF、初始化地址映射、栈和 PC。接着 Host 的线程调用 </w:t>
       </w:r>
       <w:r>
         <w:rPr>
@@ -1678,21 +1504,7 @@
           <w:sz w:val="21"/>
           <w:lang w:val="en-US" w:eastAsia="zh-CN"/>
         </w:rPr>
-        <w:t>，adapter 按上一节的方法协调 gem5 EventQueue 与 SystemC 时间。</w:t>
-      </w:r>
-    </w:p>
-    <w:p>
-      <w:pPr>
-        <w:pStyle w:val="Heading3"/>
-      </w:pPr>
-      <w:r>
-        <w:rPr>
-          <w:rFonts w:ascii="Arial Unicode MS" w:hAnsi="Arial Unicode MS" w:eastAsia="Arial Unicode MS" w:hint="eastAsia"/>
-          <w:color w:val="000000"/>
-          <w:sz w:val="23"/>
-          <w:lang w:val="en-US" w:eastAsia="zh-CN"/>
-        </w:rPr>
-        <w:t>5 处理退出和 drain</w:t>
+        <w:t>，CPU 才开始在事件调度下执行 Guest。</w:t>
       </w:r>
     </w:p>
     <w:p>
@@ -1703,7 +1515,7 @@
           <w:sz w:val="21"/>
           <w:lang w:val="en-US" w:eastAsia="zh-CN"/>
         </w:rPr>
-        <w:t xml:space="preserve">Guest 执行退出系统调用后，gem5 产生 </w:t>
+        <w:t xml:space="preserve">Guest 退出时，gem5 返回一个 </w:t>
       </w:r>
       <w:r>
         <w:rPr>
@@ -1721,7 +1533,7 @@
           <w:sz w:val="21"/>
           <w:lang w:val="en-US" w:eastAsia="zh-CN"/>
         </w:rPr>
-        <w:t xml:space="preserve">。第一章没有外部 NPU 请求，因此检查退出原因、退出码和退出时的时间对齐后就调用 </w:t>
+        <w:t xml:space="preserve">。Host 检查退出原因、退出码，以及这个时刻两边的时间是否对齐，然后调用 </w:t>
       </w:r>
       <w:r>
         <w:rPr>
@@ -1739,7 +1551,7 @@
           <w:sz w:val="21"/>
           <w:lang w:val="en-US" w:eastAsia="zh-CN"/>
         </w:rPr>
-        <w:t>，并未执行完整系统 drain。超时事件也可能带有退出码 0，不能只用退出码判断成功。</w:t>
+        <w:t>，最后导出统计。</w:t>
       </w:r>
     </w:p>
     <w:p>
@@ -1750,7 +1562,7 @@
           <w:sz w:val="21"/>
           <w:lang w:val="en-US" w:eastAsia="zh-CN"/>
         </w:rPr>
-        <w:t xml:space="preserve">加入 DMA 和异步 Engine 后，应先停止接受新工作，保留在途请求所需的完成回调并继续推进事件，待请求排空后再停止仿真。不能先屏蔽全部通知，否则 drain 可能永远无法结束。应用级请求排空与 gem5 </w:t>
+        <w:t xml:space="preserve">这里不能只检查退出码是否为 0，因为 </w:t>
       </w:r>
       <w:r>
         <w:rPr>
@@ -1759,7 +1571,7 @@
           <w:sz w:val="20"/>
           <w:lang w:val="en-US" w:eastAsia="zh-CN"/>
         </w:rPr>
-        <w:t>DrainManager</w:t>
+        <w:t>simulate()</w:t>
       </w:r>
       <w:r>
         <w:rPr>
@@ -1768,7 +1580,7 @@
           <w:sz w:val="21"/>
           <w:lang w:val="en-US" w:eastAsia="zh-CN"/>
         </w:rPr>
-        <w:t xml:space="preserve"> 的协议也需要分别处理。</w:t>
+        <w:t xml:space="preserve"> 达到时间上限时，也可能返回 code=0。示例会同时确认退出原因是最后一个 Guest 线程正常结束。</w:t>
       </w:r>
     </w:p>
     <w:p>
@@ -1779,7 +1591,7 @@
           <w:sz w:val="21"/>
           <w:lang w:val="en-US" w:eastAsia="zh-CN"/>
         </w:rPr>
-        <w:t>这也是周期模型中一个经常被忽略的问题：程序结束只是软件事件，硬件队列可能仍有工作。</w:t>
+        <w:t>本篇还没有 NPU 请求，可以这样直接停止。后面加上 DMA 后，就要考虑另一种情况：Guest 已经退出，但最后一笔数据还没写回。这时需要先停止提交新工作，继续处理在途请求，等它们排空后再退出，也就是 drain。完成回调在此期间仍要保留，否则请求等不到响应，反而退不出去。具体实现放到后面接 DMA 时再讲。</w:t>
       </w:r>
     </w:p>
     <w:p>
@@ -1793,7 +1605,7 @@
           <w:sz w:val="26"/>
           <w:lang w:val="en-US" w:eastAsia="zh-CN"/>
         </w:rPr>
-        <w:t>六 准备构建环境</w:t>
+        <w:t>五 把例子跑起来</w:t>
       </w:r>
     </w:p>
     <w:p>
@@ -1804,7 +1616,55 @@
           <w:sz w:val="21"/>
           <w:lang w:val="en-US" w:eastAsia="zh-CN"/>
         </w:rPr>
-        <w:t>本文选用以下目标依赖版本。当前运行验证来自 macOS arm64 上已有的 gem5 构建和 SystemC 2.3.4；尚未完成官方干净源码在 Linux/macOS 上的全量构建验证，因此下表不是已通过测试的跨平台兼容矩阵：</w:t>
+        <w:t>先下载仓库，后面的命令都在仓库根目录执行：</w:t>
+      </w:r>
+    </w:p>
+    <w:p>
+      <w:pPr>
+        <w:keepLines/>
+        <w:spacing w:before="80" w:after="160" w:line="276" w:lineRule="auto"/>
+        <w:ind w:left="198" w:right="198"/>
+        <w:shd w:fill="F3F5F7"/>
+      </w:pPr>
+      <w:r>
+        <w:rPr>
+          <w:rFonts w:ascii="Menlo" w:hAnsi="Menlo" w:eastAsia="Arial Unicode MS" w:hint="eastAsia"/>
+          <w:color w:val="232D37"/>
+          <w:sz w:val="17"/>
+          <w:lang w:val="en-US" w:eastAsia="zh-CN"/>
+        </w:rPr>
+        <w:t>git clone https://github.com/Ch1-n/npu-system-modeling.git</w:t>
+        <w:br/>
+        <w:t>cd npu-system-modeling</w:t>
+      </w:r>
+    </w:p>
+    <w:p>
+      <w:r>
+        <w:rPr>
+          <w:rFonts w:ascii="Arial Unicode MS" w:hAnsi="Arial Unicode MS" w:eastAsia="Arial Unicode MS" w:hint="eastAsia"/>
+          <w:color w:val="20242A"/>
+          <w:sz w:val="21"/>
+          <w:lang w:val="en-US" w:eastAsia="zh-CN"/>
+        </w:rPr>
+        <w:t xml:space="preserve">下面是示例选用的依赖版本。本机已在 macOS arm64、SystemC 2.3.4 和已有 gem5 构建上跑通；官方干净源码的完整构建、Linux 环境还没有验证完。具体进度放在仓库的 </w:t>
+      </w:r>
+      <w:r>
+        <w:rPr>
+          <w:rFonts w:ascii="Menlo" w:hAnsi="Menlo" w:eastAsia="Arial Unicode MS" w:hint="eastAsia"/>
+          <w:color w:val="204E79"/>
+          <w:sz w:val="20"/>
+          <w:lang w:val="en-US" w:eastAsia="zh-CN"/>
+        </w:rPr>
+        <w:t>docs/VALIDATION.md</w:t>
+      </w:r>
+      <w:r>
+        <w:rPr>
+          <w:rFonts w:ascii="Arial Unicode MS" w:hAnsi="Arial Unicode MS" w:eastAsia="Arial Unicode MS" w:hint="eastAsia"/>
+          <w:color w:val="20242A"/>
+          <w:sz w:val="21"/>
+          <w:lang w:val="en-US" w:eastAsia="zh-CN"/>
+        </w:rPr>
+        <w:t>，读者复现前可以先看一下。</w:t>
       </w:r>
     </w:p>
     <w:tbl>
@@ -2073,7 +1933,7 @@
                 <w:sz w:val="18"/>
                 <w:lang w:val="en-US" w:eastAsia="zh-CN"/>
               </w:rPr>
-              <w:t>NPU 模型与外部事件内核</w:t>
+              <w:t>外部事件内核与硬件模型</w:t>
             </w:r>
           </w:p>
         </w:tc>
@@ -2316,7 +2176,7 @@
                 <w:sz w:val="18"/>
                 <w:lang w:val="en-US" w:eastAsia="zh-CN"/>
               </w:rPr>
-              <w:t>构建示例 Host 和 SystemC 模型</w:t>
+              <w:t>构建 C++ 示例</w:t>
             </w:r>
           </w:p>
         </w:tc>
@@ -2399,7 +2259,7 @@
                 <w:sz w:val="18"/>
                 <w:lang w:val="en-US" w:eastAsia="zh-CN"/>
               </w:rPr>
-              <w:t>Host 模型编译</w:t>
+              <w:t>编译 Host</w:t>
             </w:r>
           </w:p>
         </w:tc>
@@ -2418,7 +2278,32 @@
           <w:sz w:val="21"/>
           <w:lang w:val="en-US" w:eastAsia="zh-CN"/>
         </w:rPr>
-        <w:t xml:space="preserve">仓库没有复制 gem5 或 SystemC 源码。脚本会下载固定版本的 gem5；SystemC 建议安装 2.3.4，或者自行编译后设置 </w:t>
+        <w:t>构建前还需要准备 Python 开发文件、venv、zlib 开发文件，以及 curl、tar 等工具。仓库脚本负责下载 gem5 和准备 SCons，不代替系统包管理器。Linux 的依赖安装可参考文末 gem5 官方构建文档。</w:t>
+      </w:r>
+    </w:p>
+    <w:p>
+      <w:pPr>
+        <w:pStyle w:val="Heading3"/>
+      </w:pPr>
+      <w:r>
+        <w:rPr>
+          <w:rFonts w:ascii="Arial Unicode MS" w:hAnsi="Arial Unicode MS" w:eastAsia="Arial Unicode MS" w:hint="eastAsia"/>
+          <w:color w:val="000000"/>
+          <w:sz w:val="23"/>
+          <w:lang w:val="en-US" w:eastAsia="zh-CN"/>
+        </w:rPr>
+        <w:t>先单独运行 SystemC</w:t>
+      </w:r>
+    </w:p>
+    <w:p>
+      <w:r>
+        <w:rPr>
+          <w:rFonts w:ascii="Arial Unicode MS" w:hAnsi="Arial Unicode MS" w:eastAsia="Arial Unicode MS" w:hint="eastAsia"/>
+          <w:color w:val="20242A"/>
+          <w:sz w:val="21"/>
+          <w:lang w:val="en-US" w:eastAsia="zh-CN"/>
+        </w:rPr>
+        <w:t xml:space="preserve">设置 </w:t>
       </w:r>
       <w:r>
         <w:rPr>
@@ -2436,36 +2321,7 @@
           <w:sz w:val="21"/>
           <w:lang w:val="en-US" w:eastAsia="zh-CN"/>
         </w:rPr>
-        <w:t>。包管理器当前默认版本可能已更新，不能假定直接安装就一定得到 2.3.4。</w:t>
-      </w:r>
-    </w:p>
-    <w:p>
-      <w:r>
-        <w:rPr>
-          <w:rFonts w:ascii="Arial Unicode MS" w:hAnsi="Arial Unicode MS" w:eastAsia="Arial Unicode MS" w:hint="eastAsia"/>
-          <w:color w:val="20242A"/>
-          <w:sz w:val="21"/>
-          <w:lang w:val="en-US" w:eastAsia="zh-CN"/>
-        </w:rPr>
-        <w:t xml:space="preserve">脚本不是系统依赖的一键安装器。开始前需要 C/C++ 工具链、CMake、curl、tar、Python 的 venv 与开发文件，以及 zlib 开发文件；其他可选组件按 gem5 构建输出处理。Linux 软件包名称和编译器要求请对照文末 gem5 构建文档。Host 当前使用 C++17，SystemC 库的 C++ 标准与 ABI 必须匹配。测试范围与剩余验证项记录在仓库 </w:t>
-      </w:r>
-      <w:r>
-        <w:rPr>
-          <w:rFonts w:ascii="Menlo" w:hAnsi="Menlo" w:eastAsia="Arial Unicode MS" w:hint="eastAsia"/>
-          <w:color w:val="204E79"/>
-          <w:sz w:val="20"/>
-          <w:lang w:val="en-US" w:eastAsia="zh-CN"/>
-        </w:rPr>
-        <w:t>docs/VALIDATION.md</w:t>
-      </w:r>
-      <w:r>
-        <w:rPr>
-          <w:rFonts w:ascii="Arial Unicode MS" w:hAnsi="Arial Unicode MS" w:eastAsia="Arial Unicode MS" w:hint="eastAsia"/>
-          <w:color w:val="20242A"/>
-          <w:sz w:val="21"/>
-          <w:lang w:val="en-US" w:eastAsia="zh-CN"/>
-        </w:rPr>
-        <w:t>。</w:t>
+        <w:t>，让 CMake 找到 SystemC 的头文件和库。建议先用 2.3.4，并确认它和 Host 的 C++17、编译器 ABI 兼容。</w:t>
       </w:r>
     </w:p>
     <w:p>
@@ -2493,25 +2349,7 @@
           <w:sz w:val="21"/>
           <w:lang w:val="en-US" w:eastAsia="zh-CN"/>
         </w:rPr>
-        <w:t xml:space="preserve">在 macOS Homebrew 环境中，它通常指向 </w:t>
-      </w:r>
-      <w:r>
-        <w:rPr>
-          <w:rFonts w:ascii="Menlo" w:hAnsi="Menlo" w:eastAsia="Arial Unicode MS" w:hint="eastAsia"/>
-          <w:color w:val="204E79"/>
-          <w:sz w:val="20"/>
-          <w:lang w:val="en-US" w:eastAsia="zh-CN"/>
-        </w:rPr>
-        <w:t>opt</w:t>
-      </w:r>
-      <w:r>
-        <w:rPr>
-          <w:rFonts w:ascii="Arial Unicode MS" w:hAnsi="Arial Unicode MS" w:eastAsia="Arial Unicode MS" w:hint="eastAsia"/>
-          <w:color w:val="20242A"/>
-          <w:sz w:val="21"/>
-          <w:lang w:val="en-US" w:eastAsia="zh-CN"/>
-        </w:rPr>
-        <w:t xml:space="preserve"> 软链接或版本化 Cellar 目录：</w:t>
+        <w:t>如果用 macOS Homebrew 安装，路径可能是下面两种之一，按实际安装位置选择。Homebrew 当前默认版本不一定还是 2.3.4。</w:t>
       </w:r>
     </w:p>
     <w:p>
@@ -2530,7 +2368,7 @@
         </w:rPr>
         <w:t>export SYSTEMC_HOME=/opt/homebrew/opt/systemc</w:t>
         <w:br/>
-        <w:t># 如果没有 opt 软链接，也可以使用：</w:t>
+        <w:t># 或版本化目录：</w:t>
         <w:br/>
         <w:t>export SYSTEMC_HOME=/opt/homebrew/Cellar/systemc/2.3.4</w:t>
       </w:r>
@@ -2543,7 +2381,7 @@
           <w:sz w:val="21"/>
           <w:lang w:val="en-US" w:eastAsia="zh-CN"/>
         </w:rPr>
-        <w:t>先运行独立 SystemC 示例，确认编译器、头文件和动态库没有问题：</w:t>
+        <w:t>然后运行独立示例：</w:t>
       </w:r>
     </w:p>
     <w:p>
@@ -2577,7 +2415,35 @@
           <w:sz w:val="21"/>
           <w:lang w:val="en-US" w:eastAsia="zh-CN"/>
         </w:rPr>
-        <w:t xml:space="preserve">它会创建一个周期为 1 ns 的时钟，在第 8 个上升沿停止。默认 </w:t>
+        <w:t>这个程序只观察一个 1 ns 时钟，在第八个上升沿停止。预期输出是：</w:t>
+      </w:r>
+    </w:p>
+    <w:p>
+      <w:pPr>
+        <w:keepLines/>
+        <w:spacing w:before="80" w:after="160" w:line="276" w:lineRule="auto"/>
+        <w:ind w:left="198" w:right="198"/>
+        <w:shd w:fill="F3F5F7"/>
+      </w:pPr>
+      <w:r>
+        <w:rPr>
+          <w:rFonts w:ascii="Menlo" w:hAnsi="Menlo" w:eastAsia="Arial Unicode MS" w:hint="eastAsia"/>
+          <w:color w:val="232D37"/>
+          <w:sz w:val="17"/>
+          <w:lang w:val="en-US" w:eastAsia="zh-CN"/>
+        </w:rPr>
+        <w:t>PASS systemc_hello at 7 ns</w:t>
+      </w:r>
+    </w:p>
+    <w:p>
+      <w:r>
+        <w:rPr>
+          <w:rFonts w:ascii="Arial Unicode MS" w:hAnsi="Arial Unicode MS" w:eastAsia="Arial Unicode MS" w:hint="eastAsia"/>
+          <w:color w:val="20242A"/>
+          <w:sz w:val="21"/>
+          <w:lang w:val="en-US" w:eastAsia="zh-CN"/>
+        </w:rPr>
+        <w:t xml:space="preserve">为什么是 7 ns？因为默认 </w:t>
       </w:r>
       <w:r>
         <w:rPr>
@@ -2595,7 +2461,7 @@
           <w:sz w:val="21"/>
           <w:lang w:val="en-US" w:eastAsia="zh-CN"/>
         </w:rPr>
-        <w:t xml:space="preserve"> 在 0 ns 产生第一个上升沿，所以预期停止于 7 ns。</w:t>
+        <w:t xml:space="preserve"> 在 0 ns 就产生了第一个上升沿。</w:t>
       </w:r>
       <w:r>
         <w:rPr>
@@ -2613,21 +2479,7 @@
           <w:sz w:val="21"/>
           <w:lang w:val="en-US" w:eastAsia="zh-CN"/>
         </w:rPr>
-        <w:t xml:space="preserve"> 只禁止进程初始化执行，不会屏蔽 0 时刻的真实时钟事件。示例同时检查边沿数和停止时间。</w:t>
-      </w:r>
-    </w:p>
-    <w:p>
-      <w:pPr>
-        <w:pStyle w:val="Heading2"/>
-      </w:pPr>
-      <w:r>
-        <w:rPr>
-          <w:rFonts w:ascii="Arial Unicode MS" w:hAnsi="Arial Unicode MS" w:eastAsia="Arial Unicode MS" w:hint="eastAsia"/>
-          <w:color w:val="000000"/>
-          <w:sz w:val="26"/>
-          <w:lang w:val="en-US" w:eastAsia="zh-CN"/>
-        </w:rPr>
-        <w:t>七 分开构建 gem5.opt 与 libgem5</w:t>
+        <w:t xml:space="preserve"> 禁止的是进程初始化时的那次执行，不会屏蔽这个时钟事件。</w:t>
       </w:r>
     </w:p>
     <w:p>
@@ -2638,14 +2490,33 @@
           <w:sz w:val="21"/>
           <w:lang w:val="en-US" w:eastAsia="zh-CN"/>
         </w:rPr>
-        <w:t>本系列需要两种 gem5 产物：</w:t>
+        <w:t>这一步先通过，再去编译 gem5。否则后面一旦遇到链接错误，很难马上判断是 SystemC 安装问题，还是 gem5 的问题。</w:t>
       </w:r>
     </w:p>
     <w:p>
       <w:pPr>
-        <w:pStyle w:val="ListNumber"/>
-        <w:spacing w:after="60"/>
+        <w:pStyle w:val="Heading3"/>
       </w:pPr>
+      <w:r>
+        <w:rPr>
+          <w:rFonts w:ascii="Arial Unicode MS" w:hAnsi="Arial Unicode MS" w:eastAsia="Arial Unicode MS" w:hint="eastAsia"/>
+          <w:color w:val="000000"/>
+          <w:sz w:val="23"/>
+          <w:lang w:val="en-US" w:eastAsia="zh-CN"/>
+        </w:rPr>
+        <w:t>分别构建 gem5.opt 和 libgem5</w:t>
+      </w:r>
+    </w:p>
+    <w:p>
+      <w:r>
+        <w:rPr>
+          <w:rFonts w:ascii="Arial Unicode MS" w:hAnsi="Arial Unicode MS" w:eastAsia="Arial Unicode MS" w:hint="eastAsia"/>
+          <w:color w:val="20242A"/>
+          <w:sz w:val="21"/>
+          <w:lang w:val="en-US" w:eastAsia="zh-CN"/>
+        </w:rPr>
+        <w:t>这里需要两种 gem5 产物。</w:t>
+      </w:r>
       <w:r>
         <w:rPr>
           <w:rFonts w:ascii="Menlo" w:hAnsi="Menlo" w:eastAsia="Arial Unicode MS" w:hint="eastAsia"/>
@@ -2662,32 +2533,8 @@
           <w:sz w:val="21"/>
           <w:lang w:val="en-US" w:eastAsia="zh-CN"/>
         </w:rPr>
-        <w:t xml:space="preserve"> 用来运行 Python 配置脚本、验证 RISC-V Guest，并生成 </w:t>
+        <w:t xml:space="preserve"> 能运行 Python 配置脚本，用来先测试 Guest、生成配置；</w:t>
       </w:r>
-      <w:r>
-        <w:rPr>
-          <w:rFonts w:ascii="Menlo" w:hAnsi="Menlo" w:eastAsia="Arial Unicode MS" w:hint="eastAsia"/>
-          <w:color w:val="204E79"/>
-          <w:sz w:val="20"/>
-          <w:lang w:val="en-US" w:eastAsia="zh-CN"/>
-        </w:rPr>
-        <w:t>config.ini</w:t>
-      </w:r>
-      <w:r>
-        <w:rPr>
-          <w:rFonts w:ascii="Arial Unicode MS" w:hAnsi="Arial Unicode MS" w:eastAsia="Arial Unicode MS" w:hint="eastAsia"/>
-          <w:color w:val="20242A"/>
-          <w:sz w:val="21"/>
-          <w:lang w:val="en-US" w:eastAsia="zh-CN"/>
-        </w:rPr>
-        <w:t>。</w:t>
-      </w:r>
-    </w:p>
-    <w:p>
-      <w:pPr>
-        <w:pStyle w:val="ListNumber"/>
-        <w:spacing w:after="60"/>
-      </w:pPr>
       <w:r>
         <w:rPr>
           <w:rFonts w:ascii="Menlo" w:hAnsi="Menlo" w:eastAsia="Arial Unicode MS" w:hint="eastAsia"/>
@@ -2704,36 +2551,7 @@
           <w:sz w:val="21"/>
           <w:lang w:val="en-US" w:eastAsia="zh-CN"/>
         </w:rPr>
-        <w:t xml:space="preserve"> 由 C++ Host 链接，用来在外部 SystemC kernel 中实例化 gem5。</w:t>
-      </w:r>
-    </w:p>
-    <w:p>
-      <w:r>
-        <w:rPr>
-          <w:rFonts w:ascii="Arial Unicode MS" w:hAnsi="Arial Unicode MS" w:eastAsia="Arial Unicode MS" w:hint="eastAsia"/>
-          <w:color w:val="20242A"/>
-          <w:sz w:val="21"/>
-          <w:lang w:val="en-US" w:eastAsia="zh-CN"/>
-        </w:rPr>
-        <w:t>两者使用的 SCons 配置不同。</w:t>
-      </w:r>
-      <w:r>
-        <w:rPr>
-          <w:rFonts w:ascii="Menlo" w:hAnsi="Menlo" w:eastAsia="Arial Unicode MS" w:hint="eastAsia"/>
-          <w:color w:val="204E79"/>
-          <w:sz w:val="20"/>
-          <w:lang w:val="en-US" w:eastAsia="zh-CN"/>
-        </w:rPr>
-        <w:t>libgem5</w:t>
-      </w:r>
-      <w:r>
-        <w:rPr>
-          <w:rFonts w:ascii="Arial Unicode MS" w:hAnsi="Arial Unicode MS" w:eastAsia="Arial Unicode MS" w:hint="eastAsia"/>
-          <w:color w:val="20242A"/>
-          <w:sz w:val="21"/>
-          <w:lang w:val="en-US" w:eastAsia="zh-CN"/>
-        </w:rPr>
-        <w:t xml:space="preserve"> 需要：</w:t>
+        <w:t xml:space="preserve"> 则由 C++ Host 链接。后者采用以下选项，启用 C++ 配置接口并去掉 Python 嵌入依赖：</w:t>
       </w:r>
     </w:p>
     <w:p>
@@ -2765,7 +2583,7 @@
           <w:sz w:val="21"/>
           <w:lang w:val="en-US" w:eastAsia="zh-CN"/>
         </w:rPr>
-        <w:t>如果让它们共用一个 build 目录，SCons 可能反复重建生成文件，甚至让 Python 配置对象与 C++ 配置对象互相污染。因此示例把它们分别放在：</w:t>
+        <w:t>两种构建使用不同配置，示例将输出目录分开，避免来回切换选项导致重编译或生成文件混用：</w:t>
       </w:r>
     </w:p>
     <w:p>
@@ -2795,7 +2613,7 @@
           <w:sz w:val="21"/>
           <w:lang w:val="en-US" w:eastAsia="zh-CN"/>
         </w:rPr>
-        <w:t>运行：</w:t>
+        <w:t>按顺序执行：</w:t>
       </w:r>
     </w:p>
     <w:p>
@@ -2827,21 +2645,21 @@
           <w:sz w:val="21"/>
           <w:lang w:val="en-US" w:eastAsia="zh-CN"/>
         </w:rPr>
-        <w:t>完整编译需要一定时间。第一次构建后，后续修改本文 Host 或 SystemC 模型不需要重新编译整个 gem5。</w:t>
+        <w:t>首次编译会比较久。之后只修改本文的 Host 或 SystemC 模型时，通常不用再编译整个 gem5。</w:t>
       </w:r>
     </w:p>
     <w:p>
       <w:pPr>
-        <w:pStyle w:val="Heading2"/>
+        <w:pStyle w:val="Heading3"/>
       </w:pPr>
       <w:r>
         <w:rPr>
           <w:rFonts w:ascii="Arial Unicode MS" w:hAnsi="Arial Unicode MS" w:eastAsia="Arial Unicode MS" w:hint="eastAsia"/>
           <w:color w:val="000000"/>
-          <w:sz w:val="26"/>
+          <w:sz w:val="23"/>
           <w:lang w:val="en-US" w:eastAsia="zh-CN"/>
         </w:rPr>
-        <w:t>八 生成 C++ 配置文件</w:t>
+        <w:t>生成 config.ini</w:t>
       </w:r>
     </w:p>
     <w:p>
@@ -2852,7 +2670,25 @@
           <w:sz w:val="21"/>
           <w:lang w:val="en-US" w:eastAsia="zh-CN"/>
         </w:rPr>
-        <w:t xml:space="preserve">普通 gem5 用户经常直接运行 Python 配置脚本。C++ embedding 模式不能在 Host 中依赖 Python，因此需要先把 SimObject 配置写成 </w:t>
+        <w:t xml:space="preserve">平时直接用 gem5 时，可以在 Python 里创建 CPU、总线和内存控制器。我们的 Host 没有嵌入 Python，因此先用 </w:t>
+      </w:r>
+      <w:r>
+        <w:rPr>
+          <w:rFonts w:ascii="Menlo" w:hAnsi="Menlo" w:eastAsia="Arial Unicode MS" w:hint="eastAsia"/>
+          <w:color w:val="204E79"/>
+          <w:sz w:val="20"/>
+          <w:lang w:val="en-US" w:eastAsia="zh-CN"/>
+        </w:rPr>
+        <w:t>gem5.opt</w:t>
+      </w:r>
+      <w:r>
+        <w:rPr>
+          <w:rFonts w:ascii="Arial Unicode MS" w:hAnsi="Arial Unicode MS" w:eastAsia="Arial Unicode MS" w:hint="eastAsia"/>
+          <w:color w:val="20242A"/>
+          <w:sz w:val="21"/>
+          <w:lang w:val="en-US" w:eastAsia="zh-CN"/>
+        </w:rPr>
+        <w:t xml:space="preserve"> 把这些对象及连接关系导出成 </w:t>
       </w:r>
       <w:r>
         <w:rPr>
@@ -2870,7 +2706,7 @@
           <w:sz w:val="21"/>
           <w:lang w:val="en-US" w:eastAsia="zh-CN"/>
         </w:rPr>
-        <w:t>。</w:t>
+        <w:t>，再交给 C++ 配置管理器读取。</w:t>
       </w:r>
     </w:p>
     <w:p>
@@ -2881,7 +2717,7 @@
           <w:sz w:val="21"/>
           <w:lang w:val="en-US" w:eastAsia="zh-CN"/>
         </w:rPr>
-        <w:t>示例脚本建立一个最小 SE 系统：</w:t>
+        <w:t>本篇配置很简单：</w:t>
       </w:r>
     </w:p>
     <w:p>
@@ -2915,7 +2751,7 @@
           <w:sz w:val="21"/>
           <w:lang w:val="en-US" w:eastAsia="zh-CN"/>
         </w:rPr>
-        <w:t>生成并验证配置：</w:t>
+        <w:t>运行下面的脚本：</w:t>
       </w:r>
     </w:p>
     <w:p>
@@ -2943,7 +2779,7 @@
           <w:sz w:val="21"/>
           <w:lang w:val="en-US" w:eastAsia="zh-CN"/>
         </w:rPr>
-        <w:t xml:space="preserve">脚本首先让 </w:t>
+        <w:t xml:space="preserve">它先让 </w:t>
       </w:r>
       <w:r>
         <w:rPr>
@@ -2961,43 +2797,7 @@
           <w:sz w:val="21"/>
           <w:lang w:val="en-US" w:eastAsia="zh-CN"/>
         </w:rPr>
-        <w:t xml:space="preserve"> 运行一次 RISC-V Hello World，同时使用 </w:t>
-      </w:r>
-      <w:r>
-        <w:rPr>
-          <w:rFonts w:ascii="Menlo" w:hAnsi="Menlo" w:eastAsia="Arial Unicode MS" w:hint="eastAsia"/>
-          <w:color w:val="204E79"/>
-          <w:sz w:val="20"/>
-          <w:lang w:val="en-US" w:eastAsia="zh-CN"/>
-        </w:rPr>
-        <w:t>--dump-config</w:t>
-      </w:r>
-      <w:r>
-        <w:rPr>
-          <w:rFonts w:ascii="Arial Unicode MS" w:hAnsi="Arial Unicode MS" w:eastAsia="Arial Unicode MS" w:hint="eastAsia"/>
-          <w:color w:val="20242A"/>
-          <w:sz w:val="21"/>
-          <w:lang w:val="en-US" w:eastAsia="zh-CN"/>
-        </w:rPr>
-        <w:t xml:space="preserve"> 输出 </w:t>
-      </w:r>
-      <w:r>
-        <w:rPr>
-          <w:rFonts w:ascii="Menlo" w:hAnsi="Menlo" w:eastAsia="Arial Unicode MS" w:hint="eastAsia"/>
-          <w:color w:val="204E79"/>
-          <w:sz w:val="20"/>
-          <w:lang w:val="en-US" w:eastAsia="zh-CN"/>
-        </w:rPr>
-        <w:t>config.ini</w:t>
-      </w:r>
-      <w:r>
-        <w:rPr>
-          <w:rFonts w:ascii="Arial Unicode MS" w:hAnsi="Arial Unicode MS" w:eastAsia="Arial Unicode MS" w:hint="eastAsia"/>
-          <w:color w:val="20242A"/>
-          <w:sz w:val="21"/>
-          <w:lang w:val="en-US" w:eastAsia="zh-CN"/>
-        </w:rPr>
-        <w:t>。这样可以把问题分成两层：如果普通 gem5 都不能运行，先检查 Guest 和 gem5 构建；只有这一步通过后，再调试 C++ embedding。</w:t>
+        <w:t xml:space="preserve"> 单独跑一次 RISC-V Hello World，确认 Guest 可以正常退出，再生成 Host 使用的配置。这样调试时就有了一个参照：如果单独运行 gem5 已经失败，先不用看 SystemC 侧。</w:t>
       </w:r>
     </w:p>
     <w:p>
@@ -3017,21 +2817,21 @@
           <w:sz w:val="21"/>
           <w:lang w:val="en-US" w:eastAsia="zh-CN"/>
         </w:rPr>
-        <w:t xml:space="preserve"> 中会包含 Guest ELF 的绝对路径。移动仓库、切换电脑或更改 gem5 目录后，应当重新生成配置，不能把旧文件当成可移植资产提交。</w:t>
+        <w:t xml:space="preserve"> 里含有 Guest ELF 的绝对路径。换电脑或移动仓库后要重新生成，这个文件不提交到 Git。</w:t>
       </w:r>
     </w:p>
     <w:p>
       <w:pPr>
-        <w:pStyle w:val="Heading2"/>
+        <w:pStyle w:val="Heading3"/>
       </w:pPr>
       <w:r>
         <w:rPr>
           <w:rFonts w:ascii="Arial Unicode MS" w:hAnsi="Arial Unicode MS" w:eastAsia="Arial Unicode MS" w:hint="eastAsia"/>
           <w:color w:val="000000"/>
-          <w:sz w:val="26"/>
+          <w:sz w:val="23"/>
           <w:lang w:val="en-US" w:eastAsia="zh-CN"/>
         </w:rPr>
-        <w:t>九 构建联合仿真 Host</w:t>
+        <w:t>构建并运行 Host</w:t>
       </w:r>
     </w:p>
     <w:p>
@@ -3042,7 +2842,7 @@
           <w:sz w:val="21"/>
           <w:lang w:val="en-US" w:eastAsia="zh-CN"/>
         </w:rPr>
-        <w:t>配置准备完成后，构建 Host：</w:t>
+        <w:t>准备好配置后，编译联合仿真程序：</w:t>
       </w:r>
     </w:p>
     <w:p>
@@ -3084,7 +2884,57 @@
           <w:sz w:val="21"/>
           <w:lang w:val="en-US" w:eastAsia="zh-CN"/>
         </w:rPr>
-        <w:t>运行过程中，RISC-V CPU 在 gem5 中执行 Hello World；SystemC heartbeat 进程同时记录外部时钟。Guest 退出后，Host 打印 gem5 退出原因、tick 和 SystemC 时间，并停止仿真。</w:t>
+        <w:t xml:space="preserve">macOS 下可能遇到一种情况：编译链接成功，启动却报找不到 </w:t>
+      </w:r>
+      <w:r>
+        <w:rPr>
+          <w:rFonts w:ascii="Menlo" w:hAnsi="Menlo" w:eastAsia="Arial Unicode MS" w:hint="eastAsia"/>
+          <w:color w:val="204E79"/>
+          <w:sz w:val="20"/>
+          <w:lang w:val="en-US" w:eastAsia="zh-CN"/>
+        </w:rPr>
+        <w:t>build/RISCV_LIB/libgem5_opt.dylib</w:t>
+      </w:r>
+      <w:r>
+        <w:rPr>
+          <w:rFonts w:ascii="Arial Unicode MS" w:hAnsi="Arial Unicode MS" w:eastAsia="Arial Unicode MS" w:hint="eastAsia"/>
+          <w:color w:val="20242A"/>
+          <w:sz w:val="21"/>
+          <w:lang w:val="en-US" w:eastAsia="zh-CN"/>
+        </w:rPr>
+        <w:t xml:space="preserve">。原因是某些 gem5 构建把相对路径写进了动态库 install name。示例 CMake 已在链接后调用 </w:t>
+      </w:r>
+      <w:r>
+        <w:rPr>
+          <w:rFonts w:ascii="Menlo" w:hAnsi="Menlo" w:eastAsia="Arial Unicode MS" w:hint="eastAsia"/>
+          <w:color w:val="204E79"/>
+          <w:sz w:val="20"/>
+          <w:lang w:val="en-US" w:eastAsia="zh-CN"/>
+        </w:rPr>
+        <w:t>install_name_tool -change</w:t>
+      </w:r>
+      <w:r>
+        <w:rPr>
+          <w:rFonts w:ascii="Arial Unicode MS" w:hAnsi="Arial Unicode MS" w:eastAsia="Arial Unicode MS" w:hint="eastAsia"/>
+          <w:color w:val="20242A"/>
+          <w:sz w:val="21"/>
+          <w:lang w:val="en-US" w:eastAsia="zh-CN"/>
+        </w:rPr>
+        <w:t xml:space="preserve"> 修正这个依赖路径；Linux 使用 build RPATH 查找共享库。</w:t>
+      </w:r>
+    </w:p>
+    <w:p>
+      <w:pPr>
+        <w:pStyle w:val="Heading2"/>
+      </w:pPr>
+      <w:r>
+        <w:rPr>
+          <w:rFonts w:ascii="Arial Unicode MS" w:hAnsi="Arial Unicode MS" w:eastAsia="Arial Unicode MS" w:hint="eastAsia"/>
+          <w:color w:val="000000"/>
+          <w:sz w:val="26"/>
+          <w:lang w:val="en-US" w:eastAsia="zh-CN"/>
+        </w:rPr>
+        <w:t>六 怎么看运行结果</w:t>
       </w:r>
     </w:p>
     <w:p>
@@ -3095,100 +2945,32 @@
           <w:sz w:val="21"/>
           <w:lang w:val="en-US" w:eastAsia="zh-CN"/>
         </w:rPr>
-        <w:t>这里验证的关键点不是终端里出现一句 Hello World，而是：</w:t>
+        <w:t>本机这组配置的关键输出如下，较长的退出信息做了折行，tick 数会随版本和配置变化：</w:t>
       </w:r>
     </w:p>
     <w:p>
       <w:pPr>
-        <w:pStyle w:val="ListBullet"/>
-        <w:spacing w:after="60"/>
+        <w:keepLines/>
+        <w:spacing w:before="80" w:after="160" w:line="276" w:lineRule="auto"/>
+        <w:ind w:left="198" w:right="198"/>
+        <w:shd w:fill="F3F5F7"/>
       </w:pPr>
       <w:r>
         <w:rPr>
-          <w:rFonts w:ascii="Arial Unicode MS" w:hAnsi="Arial Unicode MS" w:eastAsia="Arial Unicode MS" w:hint="eastAsia"/>
-          <w:color w:val="20242A"/>
-          <w:sz w:val="21"/>
+          <w:rFonts w:ascii="Menlo" w:hAnsi="Menlo" w:eastAsia="Arial Unicode MS" w:hint="eastAsia"/>
+          <w:color w:val="232D37"/>
+          <w:sz w:val="17"/>
           <w:lang w:val="en-US" w:eastAsia="zh-CN"/>
         </w:rPr>
-        <w:t>Guest 确实由模拟 RISC-V CPU 取指执行。</w:t>
-      </w:r>
-    </w:p>
-    <w:p>
-      <w:pPr>
-        <w:pStyle w:val="ListBullet"/>
-        <w:spacing w:after="60"/>
-      </w:pPr>
-      <w:r>
-        <w:rPr>
-          <w:rFonts w:ascii="Arial Unicode MS" w:hAnsi="Arial Unicode MS" w:eastAsia="Arial Unicode MS" w:hint="eastAsia"/>
-          <w:color w:val="20242A"/>
-          <w:sz w:val="21"/>
-          <w:lang w:val="en-US" w:eastAsia="zh-CN"/>
-        </w:rPr>
-        <w:t xml:space="preserve">gem5 对象由 C++ </w:t>
-      </w:r>
-      <w:r>
-        <w:rPr>
-          <w:rFonts w:ascii="Menlo" w:hAnsi="Menlo" w:eastAsia="Arial Unicode MS" w:hint="eastAsia"/>
-          <w:color w:val="204E79"/>
-          <w:sz w:val="20"/>
-          <w:lang w:val="en-US" w:eastAsia="zh-CN"/>
-        </w:rPr>
-        <w:t>config.ini</w:t>
-      </w:r>
-      <w:r>
-        <w:rPr>
-          <w:rFonts w:ascii="Arial Unicode MS" w:hAnsi="Arial Unicode MS" w:eastAsia="Arial Unicode MS" w:hint="eastAsia"/>
-          <w:color w:val="20242A"/>
-          <w:sz w:val="21"/>
-          <w:lang w:val="en-US" w:eastAsia="zh-CN"/>
-        </w:rPr>
-        <w:t xml:space="preserve"> 实例化。</w:t>
-      </w:r>
-    </w:p>
-    <w:p>
-      <w:pPr>
-        <w:pStyle w:val="ListBullet"/>
-        <w:spacing w:after="60"/>
-      </w:pPr>
-      <w:r>
-        <w:rPr>
-          <w:rFonts w:ascii="Arial Unicode MS" w:hAnsi="Arial Unicode MS" w:eastAsia="Arial Unicode MS" w:hint="eastAsia"/>
-          <w:color w:val="20242A"/>
-          <w:sz w:val="21"/>
-          <w:lang w:val="en-US" w:eastAsia="zh-CN"/>
-        </w:rPr>
-        <w:t>gem5 EventQueue 由外部 SystemC kernel 推进。</w:t>
-      </w:r>
-    </w:p>
-    <w:p>
-      <w:pPr>
-        <w:pStyle w:val="ListBullet"/>
-        <w:spacing w:after="60"/>
-      </w:pPr>
-      <w:r>
-        <w:rPr>
-          <w:rFonts w:ascii="Arial Unicode MS" w:hAnsi="Arial Unicode MS" w:eastAsia="Arial Unicode MS" w:hint="eastAsia"/>
-          <w:color w:val="20242A"/>
-          <w:sz w:val="21"/>
-          <w:lang w:val="en-US" w:eastAsia="zh-CN"/>
-        </w:rPr>
-        <w:t>退出事件处的 gem5 tick 与 SystemC 时间一致，SystemC 时钟边沿持续推进。</w:t>
-      </w:r>
-    </w:p>
-    <w:p>
-      <w:pPr>
-        <w:pStyle w:val="ListBullet"/>
-        <w:spacing w:after="60"/>
-      </w:pPr>
-      <w:r>
-        <w:rPr>
-          <w:rFonts w:ascii="Arial Unicode MS" w:hAnsi="Arial Unicode MS" w:eastAsia="Arial Unicode MS" w:hint="eastAsia"/>
-          <w:color w:val="20242A"/>
-          <w:sz w:val="21"/>
-          <w:lang w:val="en-US" w:eastAsia="zh-CN"/>
-        </w:rPr>
-        <w:t>Guest 退出能够正常终止整个联合仿真进程。</w:t>
+        <w:t>Hello world!</w:t>
+        <w:br/>
+        <w:t>gem5 exit: tick=127806250</w:t>
+        <w:br/>
+        <w:t xml:space="preserve">  cause="exiting with last active thread context" code=0</w:t>
+        <w:br/>
+        <w:t>SystemC stop: time=127806250 ps npu_clock_edges=102246</w:t>
+        <w:br/>
+        <w:t>PASS gem5_systemc_host</w:t>
       </w:r>
     </w:p>
     <w:p>
@@ -3199,7 +2981,54 @@
           <w:sz w:val="21"/>
           <w:lang w:val="en-US" w:eastAsia="zh-CN"/>
         </w:rPr>
-        <w:t xml:space="preserve">示例默认最多执行 </w:t>
+        <w:t>第一句来自 RISC-V Guest。后面的退出信息显示，gem5 的 tick 和 SystemC 时间对得上，SystemC 侧也确实收到了时钟边沿。</w:t>
+      </w:r>
+      <w:r>
+        <w:rPr>
+          <w:rFonts w:ascii="Menlo" w:hAnsi="Menlo" w:eastAsia="Arial Unicode MS" w:hint="eastAsia"/>
+          <w:color w:val="204E79"/>
+          <w:sz w:val="20"/>
+          <w:lang w:val="en-US" w:eastAsia="zh-CN"/>
+        </w:rPr>
+        <w:t>npu_clock_edges</w:t>
+      </w:r>
+      <w:r>
+        <w:rPr>
+          <w:rFonts w:ascii="Arial Unicode MS" w:hAnsi="Arial Unicode MS" w:eastAsia="Arial Unicode MS" w:hint="eastAsia"/>
+          <w:color w:val="20242A"/>
+          <w:sz w:val="21"/>
+          <w:lang w:val="en-US" w:eastAsia="zh-CN"/>
+        </w:rPr>
+        <w:t xml:space="preserve"> 包含 0 时刻的上升沿，只是一个观察计数，目前还没有 NPU 计算可统计。</w:t>
+      </w:r>
+    </w:p>
+    <w:p>
+      <w:r>
+        <w:rPr>
+          <w:rFonts w:ascii="Arial Unicode MS" w:hAnsi="Arial Unicode MS" w:eastAsia="Arial Unicode MS" w:hint="eastAsia"/>
+          <w:color w:val="20242A"/>
+          <w:sz w:val="21"/>
+          <w:lang w:val="en-US" w:eastAsia="zh-CN"/>
+        </w:rPr>
+        <w:t xml:space="preserve">示例默认给 </w:t>
+      </w:r>
+      <w:r>
+        <w:rPr>
+          <w:rFonts w:ascii="Menlo" w:hAnsi="Menlo" w:eastAsia="Arial Unicode MS" w:hint="eastAsia"/>
+          <w:color w:val="204E79"/>
+          <w:sz w:val="20"/>
+          <w:lang w:val="en-US" w:eastAsia="zh-CN"/>
+        </w:rPr>
+        <w:t>simulate()</w:t>
+      </w:r>
+      <w:r>
+        <w:rPr>
+          <w:rFonts w:ascii="Arial Unicode MS" w:hAnsi="Arial Unicode MS" w:eastAsia="Arial Unicode MS" w:hint="eastAsia"/>
+          <w:color w:val="20242A"/>
+          <w:sz w:val="21"/>
+          <w:lang w:val="en-US" w:eastAsia="zh-CN"/>
+        </w:rPr>
+        <w:t xml:space="preserve"> 设置了 </w:t>
       </w:r>
       <w:r>
         <w:rPr>
@@ -3217,7 +3046,7 @@
           <w:sz w:val="21"/>
           <w:lang w:val="en-US" w:eastAsia="zh-CN"/>
         </w:rPr>
-        <w:t xml:space="preserve"> tick，即 1 ms 模拟时间；可通过第二个参数覆盖。模拟时间上限不等于墙钟超时，CI 仍应设置进程超时。输出中的 </w:t>
+        <w:t xml:space="preserve"> tick，也就是 1 ms 模拟时间的上限。可以在命令后再传一个数字来修改它。如果传 </w:t>
       </w:r>
       <w:r>
         <w:rPr>
@@ -3226,7 +3055,7 @@
           <w:sz w:val="20"/>
           <w:lang w:val="en-US" w:eastAsia="zh-CN"/>
         </w:rPr>
-        <w:t>npu_clock_edges</w:t>
+        <w:t>1</w:t>
       </w:r>
       <w:r>
         <w:rPr>
@@ -3235,21 +3064,7 @@
           <w:sz w:val="21"/>
           <w:lang w:val="en-US" w:eastAsia="zh-CN"/>
         </w:rPr>
-        <w:t xml:space="preserve"> 包含 0 时刻上升沿，不是已完成计算周期或 NPU 利用率。最终时间相等只检查一个同步点，不能替代后续双向 Bridge、提前唤醒和反压测试。</w:t>
-      </w:r>
-    </w:p>
-    <w:p>
-      <w:pPr>
-        <w:pStyle w:val="Heading2"/>
-      </w:pPr>
-      <w:r>
-        <w:rPr>
-          <w:rFonts w:ascii="Arial Unicode MS" w:hAnsi="Arial Unicode MS" w:eastAsia="Arial Unicode MS" w:hint="eastAsia"/>
-          <w:color w:val="000000"/>
-          <w:sz w:val="26"/>
-          <w:lang w:val="en-US" w:eastAsia="zh-CN"/>
-        </w:rPr>
-        <w:t>十 仓库为什么这样组织</w:t>
+        <w:t>，程序应该因为达到上限而失败，不能仍然打印 PASS。仓库里的检查脚本也覆盖了这条路径：</w:t>
       </w:r>
     </w:p>
     <w:p>
@@ -3266,27 +3081,13 @@
           <w:sz w:val="17"/>
           <w:lang w:val="en-US" w:eastAsia="zh-CN"/>
         </w:rPr>
-        <w:t>npu-system-modeling/</w:t>
+        <w:t>ctest --test-dir build/systemc-hello --output-on-failure</w:t>
         <w:br/>
-        <w:t>├── docs/</w:t>
+        <w:t>python3 tests/check_chapter01_host.py \</w:t>
         <w:br/>
-        <w:t>│   ├── chapter-01-gem5-systemc-foundation.md</w:t>
+        <w:t xml:space="preserve">  build/gem5-systemc-host/gem5_systemc_host \</w:t>
         <w:br/>
-        <w:t>│   └── images/chapter-01/</w:t>
-        <w:br/>
-        <w:t>├── examples/chapter-01/</w:t>
-        <w:br/>
-        <w:t>│   ├── systemc-hello/</w:t>
-        <w:br/>
-        <w:t>│   └── gem5-systemc-host/</w:t>
-        <w:br/>
-        <w:t>├── scripts/</w:t>
-        <w:br/>
-        <w:t>├── third_party/          # 下载生成，不提交</w:t>
-        <w:br/>
-        <w:t>├── build/                # 构建生成，不提交</w:t>
-        <w:br/>
-        <w:t>└── SERIES_OUTLINE.md</w:t>
+        <w:t xml:space="preserve">  build/chapter-01/config.ini</w:t>
       </w:r>
     </w:p>
     <w:p>
@@ -3297,61 +3098,7 @@
           <w:sz w:val="21"/>
           <w:lang w:val="en-US" w:eastAsia="zh-CN"/>
         </w:rPr>
-        <w:t>文章、图片和对应代码在同一个 Git 提交中演进。每完成一章就创建一个 Tag，读者可以停留在任意阶段复现当时的最小系统。</w:t>
-      </w:r>
-      <w:r>
-        <w:rPr>
-          <w:rFonts w:ascii="Menlo" w:hAnsi="Menlo" w:eastAsia="Arial Unicode MS" w:hint="eastAsia"/>
-          <w:color w:val="204E79"/>
-          <w:sz w:val="20"/>
-          <w:lang w:val="en-US" w:eastAsia="zh-CN"/>
-        </w:rPr>
-        <w:t>third_party</w:t>
-      </w:r>
-      <w:r>
-        <w:rPr>
-          <w:rFonts w:ascii="Arial Unicode MS" w:hAnsi="Arial Unicode MS" w:eastAsia="Arial Unicode MS" w:hint="eastAsia"/>
-          <w:color w:val="20242A"/>
-          <w:sz w:val="21"/>
-          <w:lang w:val="en-US" w:eastAsia="zh-CN"/>
-        </w:rPr>
-        <w:t>、</w:t>
-      </w:r>
-      <w:r>
-        <w:rPr>
-          <w:rFonts w:ascii="Menlo" w:hAnsi="Menlo" w:eastAsia="Arial Unicode MS" w:hint="eastAsia"/>
-          <w:color w:val="204E79"/>
-          <w:sz w:val="20"/>
-          <w:lang w:val="en-US" w:eastAsia="zh-CN"/>
-        </w:rPr>
-        <w:t>build</w:t>
-      </w:r>
-      <w:r>
-        <w:rPr>
-          <w:rFonts w:ascii="Arial Unicode MS" w:hAnsi="Arial Unicode MS" w:eastAsia="Arial Unicode MS" w:hint="eastAsia"/>
-          <w:color w:val="20242A"/>
-          <w:sz w:val="21"/>
-          <w:lang w:val="en-US" w:eastAsia="zh-CN"/>
-        </w:rPr>
-        <w:t>、</w:t>
-      </w:r>
-      <w:r>
-        <w:rPr>
-          <w:rFonts w:ascii="Menlo" w:hAnsi="Menlo" w:eastAsia="Arial Unicode MS" w:hint="eastAsia"/>
-          <w:color w:val="204E79"/>
-          <w:sz w:val="20"/>
-          <w:lang w:val="en-US" w:eastAsia="zh-CN"/>
-        </w:rPr>
-        <w:t>config.ini</w:t>
-      </w:r>
-      <w:r>
-        <w:rPr>
-          <w:rFonts w:ascii="Arial Unicode MS" w:hAnsi="Arial Unicode MS" w:eastAsia="Arial Unicode MS" w:hint="eastAsia"/>
-          <w:color w:val="20242A"/>
-          <w:sz w:val="21"/>
-          <w:lang w:val="en-US" w:eastAsia="zh-CN"/>
-        </w:rPr>
-        <w:t xml:space="preserve"> 和运行日志不提交，以免仓库混入第三方源码、绝对路径和过期产物。</w:t>
+        <w:t>模拟时间上限和我们实际等待的时间是两回事。假如 Host 自己卡在一个不让出控制权的循环里，模拟时间也可能停住，所以检查脚本另外给每个进程设置了 60 秒的墙钟超时。</w:t>
       </w:r>
     </w:p>
     <w:p>
@@ -3362,7 +3109,7 @@
           <w:sz w:val="21"/>
           <w:lang w:val="en-US" w:eastAsia="zh-CN"/>
         </w:rPr>
-        <w:t>后续从实际工程整理 common 模块时，也会遵循同一原则：保留通用机制，替换产品接口和参数。核心 Tensor、Vector/ACVT 等 Engine 不进入公开仓库，而是使用独立的教学计算单元维持完整数据流。</w:t>
+        <w:t>到这里，验证的是 Guest 执行、两个框架的启动和退出，以及退出时的时间对齐。CPU 与 NPU 还没有交换请求，暂时也看不到带宽、计算吞吐率这些结果。下一篇接上命令 Bridge 后，才开始检查请求有没有丢失、返回时间是否正确。</w:t>
       </w:r>
     </w:p>
     <w:p>
@@ -3376,109 +3123,7 @@
           <w:sz w:val="26"/>
           <w:lang w:val="en-US" w:eastAsia="zh-CN"/>
         </w:rPr>
-        <w:t>十一 常见问题</w:t>
-      </w:r>
-    </w:p>
-    <w:p>
-      <w:pPr>
-        <w:pStyle w:val="Heading3"/>
-      </w:pPr>
-      <w:r>
-        <w:rPr>
-          <w:rFonts w:ascii="Arial Unicode MS" w:hAnsi="Arial Unicode MS" w:eastAsia="Arial Unicode MS" w:hint="eastAsia"/>
-          <w:color w:val="000000"/>
-          <w:sz w:val="23"/>
-          <w:lang w:val="en-US" w:eastAsia="zh-CN"/>
-        </w:rPr>
-        <w:t>把 USE_SYSTEMC 当成唯一开关</w:t>
-      </w:r>
-    </w:p>
-    <w:p>
-      <w:r>
-        <w:rPr>
-          <w:rFonts w:ascii="Menlo" w:hAnsi="Menlo" w:eastAsia="Arial Unicode MS" w:hint="eastAsia"/>
-          <w:color w:val="204E79"/>
-          <w:sz w:val="20"/>
-          <w:lang w:val="en-US" w:eastAsia="zh-CN"/>
-        </w:rPr>
-        <w:t>USE_SYSTEMC=y</w:t>
-      </w:r>
-      <w:r>
-        <w:rPr>
-          <w:rFonts w:ascii="Arial Unicode MS" w:hAnsi="Arial Unicode MS" w:eastAsia="Arial Unicode MS" w:hint="eastAsia"/>
-          <w:color w:val="20242A"/>
-          <w:sz w:val="21"/>
-          <w:lang w:val="en-US" w:eastAsia="zh-CN"/>
-        </w:rPr>
-        <w:t xml:space="preserve"> 并不是所有 gem5 + SystemC 方案的必要条件。本文使用外部 SystemC kernel 加 </w:t>
-      </w:r>
-      <w:r>
-        <w:rPr>
-          <w:rFonts w:ascii="Menlo" w:hAnsi="Menlo" w:eastAsia="Arial Unicode MS" w:hint="eastAsia"/>
-          <w:color w:val="204E79"/>
-          <w:sz w:val="20"/>
-          <w:lang w:val="en-US" w:eastAsia="zh-CN"/>
-        </w:rPr>
-        <w:t>gem5_within_systemc</w:t>
-      </w:r>
-      <w:r>
-        <w:rPr>
-          <w:rFonts w:ascii="Arial Unicode MS" w:hAnsi="Arial Unicode MS" w:eastAsia="Arial Unicode MS" w:hint="eastAsia"/>
-          <w:color w:val="20242A"/>
-          <w:sz w:val="21"/>
-          <w:lang w:val="en-US" w:eastAsia="zh-CN"/>
-        </w:rPr>
-        <w:t xml:space="preserve"> adapter，</w:t>
-      </w:r>
-      <w:r>
-        <w:rPr>
-          <w:rFonts w:ascii="Menlo" w:hAnsi="Menlo" w:eastAsia="Arial Unicode MS" w:hint="eastAsia"/>
-          <w:color w:val="204E79"/>
-          <w:sz w:val="20"/>
-          <w:lang w:val="en-US" w:eastAsia="zh-CN"/>
-        </w:rPr>
-        <w:t>libgem5</w:t>
-      </w:r>
-      <w:r>
-        <w:rPr>
-          <w:rFonts w:ascii="Arial Unicode MS" w:hAnsi="Arial Unicode MS" w:eastAsia="Arial Unicode MS" w:hint="eastAsia"/>
-          <w:color w:val="20242A"/>
-          <w:sz w:val="21"/>
-          <w:lang w:val="en-US" w:eastAsia="zh-CN"/>
-        </w:rPr>
-        <w:t xml:space="preserve"> 构建为 </w:t>
-      </w:r>
-      <w:r>
-        <w:rPr>
-          <w:rFonts w:ascii="Menlo" w:hAnsi="Menlo" w:eastAsia="Arial Unicode MS" w:hint="eastAsia"/>
-          <w:color w:val="204E79"/>
-          <w:sz w:val="20"/>
-          <w:lang w:val="en-US" w:eastAsia="zh-CN"/>
-        </w:rPr>
-        <w:t>USE_SYSTEMC=n</w:t>
-      </w:r>
-      <w:r>
-        <w:rPr>
-          <w:rFonts w:ascii="Arial Unicode MS" w:hAnsi="Arial Unicode MS" w:eastAsia="Arial Unicode MS" w:hint="eastAsia"/>
-          <w:color w:val="20242A"/>
-          <w:sz w:val="21"/>
-          <w:lang w:val="en-US" w:eastAsia="zh-CN"/>
-        </w:rPr>
-        <w:t>。判断配置是否正确，首先要明确谁拥有 SystemC kernel。</w:t>
-      </w:r>
-    </w:p>
-    <w:p>
-      <w:pPr>
-        <w:pStyle w:val="Heading3"/>
-      </w:pPr>
-      <w:r>
-        <w:rPr>
-          <w:rFonts w:ascii="Arial Unicode MS" w:hAnsi="Arial Unicode MS" w:eastAsia="Arial Unicode MS" w:hint="eastAsia"/>
-          <w:color w:val="000000"/>
-          <w:sz w:val="23"/>
-          <w:lang w:val="en-US" w:eastAsia="zh-CN"/>
-        </w:rPr>
-        <w:t>gem5.opt 和 libgem5 共用构建目录</w:t>
+        <w:t>七 后面准备怎么接着做</w:t>
       </w:r>
     </w:p>
     <w:p>
@@ -3489,91 +3134,7 @@
           <w:sz w:val="21"/>
           <w:lang w:val="en-US" w:eastAsia="zh-CN"/>
         </w:rPr>
-        <w:t xml:space="preserve">两类产物的配置不同。混用 build 目录会造成大量无效重编译，并可能出现生成头文件不一致。固定使用独立的 </w:t>
-      </w:r>
-      <w:r>
-        <w:rPr>
-          <w:rFonts w:ascii="Menlo" w:hAnsi="Menlo" w:eastAsia="Arial Unicode MS" w:hint="eastAsia"/>
-          <w:color w:val="204E79"/>
-          <w:sz w:val="20"/>
-          <w:lang w:val="en-US" w:eastAsia="zh-CN"/>
-        </w:rPr>
-        <w:t>RISCV_OPT</w:t>
-      </w:r>
-      <w:r>
-        <w:rPr>
-          <w:rFonts w:ascii="Arial Unicode MS" w:hAnsi="Arial Unicode MS" w:eastAsia="Arial Unicode MS" w:hint="eastAsia"/>
-          <w:color w:val="20242A"/>
-          <w:sz w:val="21"/>
-          <w:lang w:val="en-US" w:eastAsia="zh-CN"/>
-        </w:rPr>
-        <w:t xml:space="preserve"> 和 </w:t>
-      </w:r>
-      <w:r>
-        <w:rPr>
-          <w:rFonts w:ascii="Menlo" w:hAnsi="Menlo" w:eastAsia="Arial Unicode MS" w:hint="eastAsia"/>
-          <w:color w:val="204E79"/>
-          <w:sz w:val="20"/>
-          <w:lang w:val="en-US" w:eastAsia="zh-CN"/>
-        </w:rPr>
-        <w:t>RISCV_LIB</w:t>
-      </w:r>
-      <w:r>
-        <w:rPr>
-          <w:rFonts w:ascii="Arial Unicode MS" w:hAnsi="Arial Unicode MS" w:eastAsia="Arial Unicode MS" w:hint="eastAsia"/>
-          <w:color w:val="20242A"/>
-          <w:sz w:val="21"/>
-          <w:lang w:val="en-US" w:eastAsia="zh-CN"/>
-        </w:rPr>
-        <w:t>。</w:t>
-      </w:r>
-    </w:p>
-    <w:p>
-      <w:pPr>
-        <w:pStyle w:val="Heading3"/>
-      </w:pPr>
-      <w:r>
-        <w:rPr>
-          <w:rFonts w:ascii="Arial Unicode MS" w:hAnsi="Arial Unicode MS" w:eastAsia="Arial Unicode MS" w:hint="eastAsia"/>
-          <w:color w:val="000000"/>
-          <w:sz w:val="23"/>
-          <w:lang w:val="en-US" w:eastAsia="zh-CN"/>
-        </w:rPr>
-        <w:t>复制旧 config.ini 到新路径</w:t>
-      </w:r>
-    </w:p>
-    <w:p>
-      <w:r>
-        <w:rPr>
-          <w:rFonts w:ascii="Menlo" w:hAnsi="Menlo" w:eastAsia="Arial Unicode MS" w:hint="eastAsia"/>
-          <w:color w:val="204E79"/>
-          <w:sz w:val="20"/>
-          <w:lang w:val="en-US" w:eastAsia="zh-CN"/>
-        </w:rPr>
-        <w:t>config.ini</w:t>
-      </w:r>
-      <w:r>
-        <w:rPr>
-          <w:rFonts w:ascii="Arial Unicode MS" w:hAnsi="Arial Unicode MS" w:eastAsia="Arial Unicode MS" w:hint="eastAsia"/>
-          <w:color w:val="20242A"/>
-          <w:sz w:val="21"/>
-          <w:lang w:val="en-US" w:eastAsia="zh-CN"/>
-        </w:rPr>
-        <w:t xml:space="preserve"> 可能包含 Guest、重定向目录和资源文件的绝对路径。仓库移动后重新生成，比手工替换字符串可靠。</w:t>
-      </w:r>
-    </w:p>
-    <w:p>
-      <w:pPr>
-        <w:pStyle w:val="Heading3"/>
-      </w:pPr>
-      <w:r>
-        <w:rPr>
-          <w:rFonts w:ascii="Arial Unicode MS" w:hAnsi="Arial Unicode MS" w:eastAsia="Arial Unicode MS" w:hint="eastAsia"/>
-          <w:color w:val="000000"/>
-          <w:sz w:val="23"/>
-          <w:lang w:val="en-US" w:eastAsia="zh-CN"/>
-        </w:rPr>
-        <w:t>macOS 找不到 libgem5</w:t>
+        <w:t>这篇先把环境搭到能运行一个小程序。下一篇会加一个简单的 Echo/Add 设备，让 CPU 发出命令，SystemC 侧等若干周期后返回结果。这样就能沿着一条真实请求，看清 CPU 在哪里等待、设备何时完成，以及响应怎么送回来。</w:t>
       </w:r>
     </w:p>
     <w:p>
@@ -3584,75 +3145,7 @@
           <w:sz w:val="21"/>
           <w:lang w:val="en-US" w:eastAsia="zh-CN"/>
         </w:rPr>
-        <w:t xml:space="preserve">某些 gem5 构建生成的动态库 install name 是相对于 gem5 源码目录的路径。即使 CMake 使用绝对路径链接，程序启动时仍可能报告找不到 </w:t>
-      </w:r>
-      <w:r>
-        <w:rPr>
-          <w:rFonts w:ascii="Menlo" w:hAnsi="Menlo" w:eastAsia="Arial Unicode MS" w:hint="eastAsia"/>
-          <w:color w:val="204E79"/>
-          <w:sz w:val="20"/>
-          <w:lang w:val="en-US" w:eastAsia="zh-CN"/>
-        </w:rPr>
-        <w:t>build/RISCV_LIB/libgem5_opt.dylib</w:t>
-      </w:r>
-      <w:r>
-        <w:rPr>
-          <w:rFonts w:ascii="Arial Unicode MS" w:hAnsi="Arial Unicode MS" w:eastAsia="Arial Unicode MS" w:hint="eastAsia"/>
-          <w:color w:val="20242A"/>
-          <w:sz w:val="21"/>
-          <w:lang w:val="en-US" w:eastAsia="zh-CN"/>
-        </w:rPr>
-        <w:t xml:space="preserve">。示例 CMake 在链接后调用 </w:t>
-      </w:r>
-      <w:r>
-        <w:rPr>
-          <w:rFonts w:ascii="Menlo" w:hAnsi="Menlo" w:eastAsia="Arial Unicode MS" w:hint="eastAsia"/>
-          <w:color w:val="204E79"/>
-          <w:sz w:val="20"/>
-          <w:lang w:val="en-US" w:eastAsia="zh-CN"/>
-        </w:rPr>
-        <w:t>install_name_tool -change</w:t>
-      </w:r>
-      <w:r>
-        <w:rPr>
-          <w:rFonts w:ascii="Arial Unicode MS" w:hAnsi="Arial Unicode MS" w:eastAsia="Arial Unicode MS" w:hint="eastAsia"/>
-          <w:color w:val="20242A"/>
-          <w:sz w:val="21"/>
-          <w:lang w:val="en-US" w:eastAsia="zh-CN"/>
-        </w:rPr>
-        <w:t xml:space="preserve">，把可执行文件中的依赖改为当前 </w:t>
-      </w:r>
-      <w:r>
-        <w:rPr>
-          <w:rFonts w:ascii="Menlo" w:hAnsi="Menlo" w:eastAsia="Arial Unicode MS" w:hint="eastAsia"/>
-          <w:color w:val="204E79"/>
-          <w:sz w:val="20"/>
-          <w:lang w:val="en-US" w:eastAsia="zh-CN"/>
-        </w:rPr>
-        <w:t>libgem5</w:t>
-      </w:r>
-      <w:r>
-        <w:rPr>
-          <w:rFonts w:ascii="Arial Unicode MS" w:hAnsi="Arial Unicode MS" w:eastAsia="Arial Unicode MS" w:hint="eastAsia"/>
-          <w:color w:val="20242A"/>
-          <w:sz w:val="21"/>
-          <w:lang w:val="en-US" w:eastAsia="zh-CN"/>
-        </w:rPr>
-        <w:t xml:space="preserve"> 绝对路径；Linux 则通过 build RPATH 查找共享库。</w:t>
-      </w:r>
-    </w:p>
-    <w:p>
-      <w:pPr>
-        <w:pStyle w:val="Heading3"/>
-      </w:pPr>
-      <w:r>
-        <w:rPr>
-          <w:rFonts w:ascii="Arial Unicode MS" w:hAnsi="Arial Unicode MS" w:eastAsia="Arial Unicode MS" w:hint="eastAsia"/>
-          <w:color w:val="000000"/>
-          <w:sz w:val="23"/>
-          <w:lang w:val="en-US" w:eastAsia="zh-CN"/>
-        </w:rPr>
-        <w:t>用 Host 预置数据冒充 Guest 行为</w:t>
+        <w:t>再往后是数据搬运、片上存储、多 Engine 调度和 Runtime。公开版本会逐步整理原项目里可以复用的 common 模块，核心计算 Engine 则用独立的小例子替代。希望读者最后拿到的不只是几个分散的测试，而是一套能继续添加自己模块的仿真环境。</w:t>
       </w:r>
     </w:p>
     <w:p>
@@ -3663,82 +3156,7 @@
           <w:sz w:val="21"/>
           <w:lang w:val="en-US" w:eastAsia="zh-CN"/>
         </w:rPr>
-        <w:t>Host 可以通过功能接口直接写模型内存，这对测试初始化很方便，但不消耗 CPU 指令，也不经过 timing 数据通路。后续文章会把 Host preload、Guest 访问和 DMA timing 访问分别统计。</w:t>
-      </w:r>
-    </w:p>
-    <w:p>
-      <w:pPr>
-        <w:pStyle w:val="Heading3"/>
-      </w:pPr>
-      <w:r>
-        <w:rPr>
-          <w:rFonts w:ascii="Arial Unicode MS" w:hAnsi="Arial Unicode MS" w:eastAsia="Arial Unicode MS" w:hint="eastAsia"/>
-          <w:color w:val="000000"/>
-          <w:sz w:val="23"/>
-          <w:lang w:val="en-US" w:eastAsia="zh-CN"/>
-        </w:rPr>
-        <w:t>看到数值正确就认为周期模型正确</w:t>
-      </w:r>
-    </w:p>
-    <w:p>
-      <w:r>
-        <w:rPr>
-          <w:rFonts w:ascii="Arial Unicode MS" w:hAnsi="Arial Unicode MS" w:eastAsia="Arial Unicode MS" w:hint="eastAsia"/>
-          <w:color w:val="20242A"/>
-          <w:sz w:val="21"/>
-          <w:lang w:val="en-US" w:eastAsia="zh-CN"/>
-        </w:rPr>
-        <w:t>数值比对只能证明某条功能路径得到正确结果。周期模型还要验证请求是否守恒、反压时是否丢包、完成是否重复、退出时是否 drain，以及时间戳是否单调。</w:t>
-      </w:r>
-    </w:p>
-    <w:p>
-      <w:pPr>
-        <w:pStyle w:val="Heading3"/>
-      </w:pPr>
-      <w:r>
-        <w:rPr>
-          <w:rFonts w:ascii="Arial Unicode MS" w:hAnsi="Arial Unicode MS" w:eastAsia="Arial Unicode MS" w:hint="eastAsia"/>
-          <w:color w:val="000000"/>
-          <w:sz w:val="23"/>
-          <w:lang w:val="en-US" w:eastAsia="zh-CN"/>
-        </w:rPr>
-        <w:t>把 SE 模式称为裸机 SoC 或 Linux 系统</w:t>
-      </w:r>
-    </w:p>
-    <w:p>
-      <w:r>
-        <w:rPr>
-          <w:rFonts w:ascii="Arial Unicode MS" w:hAnsi="Arial Unicode MS" w:eastAsia="Arial Unicode MS" w:hint="eastAsia"/>
-          <w:color w:val="20242A"/>
-          <w:sz w:val="21"/>
-          <w:lang w:val="en-US" w:eastAsia="zh-CN"/>
-        </w:rPr>
-        <w:t>SE 模式承载的是用户态进程语义。它足以研究 CPU 指令、NPU 命令和部分存储行为，但没有模拟完整内核和板级外设。</w:t>
-      </w:r>
-    </w:p>
-    <w:p>
-      <w:pPr>
-        <w:pStyle w:val="Heading2"/>
-      </w:pPr>
-      <w:r>
-        <w:rPr>
-          <w:rFonts w:ascii="Arial Unicode MS" w:hAnsi="Arial Unicode MS" w:eastAsia="Arial Unicode MS" w:hint="eastAsia"/>
-          <w:color w:val="000000"/>
-          <w:sz w:val="26"/>
-          <w:lang w:val="en-US" w:eastAsia="zh-CN"/>
-        </w:rPr>
-        <w:t>十二 本章结论与模型边界</w:t>
-      </w:r>
-    </w:p>
-    <w:p>
-      <w:r>
-        <w:rPr>
-          <w:rFonts w:ascii="Arial Unicode MS" w:hAnsi="Arial Unicode MS" w:eastAsia="Arial Unicode MS" w:hint="eastAsia"/>
-          <w:color w:val="20242A"/>
-          <w:sz w:val="21"/>
-          <w:lang w:val="en-US" w:eastAsia="zh-CN"/>
-        </w:rPr>
-        <w:t>本章建立了后续所有功能的共同底座：RISC-V Guest 由 gem5 执行，SystemC 负责外层离散事件调度，</w:t>
+        <w:t xml:space="preserve">文章正文、代码和配图放在同一个仓库里，系列提纲保存在 </w:t>
       </w:r>
       <w:r>
         <w:rPr>
@@ -3747,7 +3165,7 @@
           <w:sz w:val="20"/>
           <w:lang w:val="en-US" w:eastAsia="zh-CN"/>
         </w:rPr>
-        <w:t>libgem5</w:t>
+        <w:t>SERIES_OUTLINE.md</w:t>
       </w:r>
       <w:r>
         <w:rPr>
@@ -3756,29 +3174,7 @@
           <w:sz w:val="21"/>
           <w:lang w:val="en-US" w:eastAsia="zh-CN"/>
         </w:rPr>
-        <w:t xml:space="preserve"> adapter 把 gem5 EventQueue 映射到同一条时间轴。</w:t>
-      </w:r>
-    </w:p>
-    <w:p>
-      <w:r>
-        <w:rPr>
-          <w:rFonts w:ascii="Arial Unicode MS" w:hAnsi="Arial Unicode MS" w:eastAsia="Arial Unicode MS" w:hint="eastAsia"/>
-          <w:color w:val="20242A"/>
-          <w:sz w:val="21"/>
-          <w:lang w:val="en-US" w:eastAsia="zh-CN"/>
-        </w:rPr>
-        <w:t>当前最小系统尚未包含 NPU 命令、DMA、Shared Memory 或计算 Engine，因此不能用于评估 NPU 性能。它验证的是当前 Hello World 路径下的启动、退出和退出时的时间对齐，不足以证明任意跨框架交互的时序正确性。</w:t>
-      </w:r>
-    </w:p>
-    <w:p>
-      <w:r>
-        <w:rPr>
-          <w:rFonts w:ascii="Arial Unicode MS" w:hAnsi="Arial Unicode MS" w:eastAsia="Arial Unicode MS" w:hint="eastAsia"/>
-          <w:color w:val="20242A"/>
-          <w:sz w:val="21"/>
-          <w:lang w:val="en-US" w:eastAsia="zh-CN"/>
-        </w:rPr>
-        <w:t>下一章将在这个 Host 中加入教学命令 Bridge。我们会让 RISC-V CPU 发出第一条自定义 NPU 指令，并仔细区分四个经常被混用的时刻：命令被接受、Engine 执行完成、软件消费结果，以及 CPU 指令最终退休。</w:t>
+        <w:t>。后续修改会保留提交记录，已经发布的章节标签也会保留，方便对照文章当时的版本。</w:t>
       </w:r>
     </w:p>
     <w:p>

</xml_diff>